<commit_message>
docs: add full official member roster (6 students), FPT University, MAS291, Nhóm 1, and instructor nhannxv
</commit_message>
<xml_diff>
--- a/outputs/reports/Computer_Project_Topic_1_Report.docx
+++ b/outputs/reports/Computer_Project_Topic_1_Report.docx
@@ -12,11 +12,9 @@
           <w:color w:val="1F497D"/>
           <w:sz w:val="26"/>
         </w:rPr>
-        <w:t>Trường Đại học [Cần bổ sung]</w:t>
+        <w:t>Trường Đại học FPT</w:t>
         <w:br/>
-        <w:t>KHOA KHOA HỌC ỨNG DỤNG</w:t>
-        <w:br/>
-        <w:t>BỘ MÔN TOÁN ỨNG DỤNG</w:t>
+        <w:t>BỘ MÔN TOÁN — HỌC PHẦN MAS291</w:t>
       </w:r>
     </w:p>
     <w:p/>
@@ -99,7 +97,7 @@
               <w:rPr>
                 <w:sz w:val="22"/>
               </w:rPr>
-              <w:t>Xác suất &amp; Thống kê ứng dụng</w:t>
+              <w:t>Xác suất &amp; Thống kê ứng dụng (MAS291)</w:t>
             </w:r>
           </w:p>
         </w:tc>
@@ -128,7 +126,7 @@
               <w:rPr>
                 <w:sz w:val="22"/>
               </w:rPr>
-              <w:t>[Cần bổ sung]</w:t>
+              <w:t>MAS291</w:t>
             </w:r>
           </w:p>
         </w:tc>
@@ -157,7 +155,7 @@
               <w:rPr>
                 <w:sz w:val="22"/>
               </w:rPr>
-              <w:t>Nhóm [Cần bổ sung]</w:t>
+              <w:t>Nhóm 1</w:t>
             </w:r>
           </w:p>
         </w:tc>
@@ -186,7 +184,46 @@
               <w:rPr>
                 <w:sz w:val="22"/>
               </w:rPr>
-              <w:t>[Cần bổ sung]</w:t>
+              <w:t>nhannxv</w:t>
+            </w:r>
+          </w:p>
+        </w:tc>
+      </w:tr>
+      <w:tr>
+        <w:tc>
+          <w:tcPr>
+            <w:tcW w:type="dxa" w:w="4680"/>
+          </w:tcPr>
+          <w:p>
+            <w:r>
+              <w:rPr>
+                <w:b/>
+                <w:sz w:val="22"/>
+              </w:rPr>
+              <w:t>Danh sách sinh viên:</w:t>
+            </w:r>
+          </w:p>
+        </w:tc>
+        <w:tc>
+          <w:tcPr>
+            <w:tcW w:type="dxa" w:w="4680"/>
+          </w:tcPr>
+          <w:p>
+            <w:r>
+              <w:rPr>
+                <w:sz w:val="22"/>
+              </w:rPr>
+              <w:t>Mai Xuân Hiếu — DE200199 (Nhóm trưởng)</w:t>
+              <w:br/>
+              <w:t>Nguyễn Hữu Hoàng Thắng — DE200281 (Thành viên)</w:t>
+              <w:br/>
+              <w:t>Trần Đức Duy — DE180206 (Thành viên)</w:t>
+              <w:br/>
+              <w:t>Phan Dương Sinh — DE200235 (Thành viên)</w:t>
+              <w:br/>
+              <w:t>Võ Ngọc Minh Quân — DE200080 (Thành viên)</w:t>
+              <w:br/>
+              <w:t>Vũ Hữu Thái — DE200132 (Thành viên)</w:t>
             </w:r>
           </w:p>
         </w:tc>
@@ -2856,7 +2893,7 @@
               <w:rPr>
                 <w:sz w:val="19"/>
               </w:rPr>
-              <w:t>[Họ và tên SV 1]</w:t>
+              <w:t>Mai Xuân Hiếu</w:t>
             </w:r>
           </w:p>
         </w:tc>
@@ -2870,7 +2907,7 @@
               <w:rPr>
                 <w:sz w:val="19"/>
               </w:rPr>
-              <w:t>[MSSV 1]</w:t>
+              <w:t>DE200199</w:t>
             </w:r>
           </w:p>
         </w:tc>
@@ -2898,7 +2935,7 @@
               <w:rPr>
                 <w:sz w:val="19"/>
               </w:rPr>
-              <w:t>Nhóm trưởng, quản trị code, tổng hợp báo cáo và kiểm tra tính toán</w:t>
+              <w:t>Quản lý tiến độ dự án, tổ chức phân công, xây dựng kiến trúc mã nguồn Python &amp; Streamlit, tổng hợp và định dạng báo cáo Word/PDF (Câu 1, 2).</w:t>
             </w:r>
           </w:p>
         </w:tc>
@@ -2918,7 +2955,7 @@
               <w:rPr>
                 <w:sz w:val="19"/>
               </w:rPr>
-              <w:t>[Họ và tên SV 2]</w:t>
+              <w:t>Nguyễn Hữu Hoàng Thắng</w:t>
             </w:r>
           </w:p>
         </w:tc>
@@ -2933,7 +2970,7 @@
               <w:rPr>
                 <w:sz w:val="19"/>
               </w:rPr>
-              <w:t>[MSSV 2]</w:t>
+              <w:t>DE200281</w:t>
             </w:r>
           </w:p>
         </w:tc>
@@ -2963,7 +3000,7 @@
               <w:rPr>
                 <w:sz w:val="19"/>
               </w:rPr>
-              <w:t>Thu thập dữ liệu, làm sạch, viết phần thống kê mô tả (Câu 1 - 4)</w:t>
+              <w:t>Thu thập dữ liệu khảo sát ẩn danh, kiểm tra tính hợp lệ, viết module làm sạch dữ liệu và thống kê mô tả (Câu 1, 2, 3).</w:t>
             </w:r>
           </w:p>
         </w:tc>
@@ -2982,7 +3019,7 @@
               <w:rPr>
                 <w:sz w:val="19"/>
               </w:rPr>
-              <w:t>[Họ và tên SV 3]</w:t>
+              <w:t>Trần Đức Duy</w:t>
             </w:r>
           </w:p>
         </w:tc>
@@ -2996,7 +3033,7 @@
               <w:rPr>
                 <w:sz w:val="19"/>
               </w:rPr>
-              <w:t>[MSSV 3]</w:t>
+              <w:t>DE180206</w:t>
             </w:r>
           </w:p>
         </w:tc>
@@ -3024,7 +3061,7 @@
               <w:rPr>
                 <w:sz w:val="19"/>
               </w:rPr>
-              <w:t>Thực hiện mô hình hồi quy OLS, chẩn đoán phần dư (Câu 5 - 8)</w:t>
+              <w:t>Vẽ đồ thị phân phối Histogram, Boxplot, phân tích ngoại lệ 1.5 IQR, tính tương quan Pearson và vẽ Scatterplot (Câu 4, 5).</w:t>
             </w:r>
           </w:p>
         </w:tc>
@@ -3044,7 +3081,7 @@
               <w:rPr>
                 <w:sz w:val="19"/>
               </w:rPr>
-              <w:t>[Họ và tên SV 4]</w:t>
+              <w:t>Phan Dương Sinh</w:t>
             </w:r>
           </w:p>
         </w:tc>
@@ -3059,7 +3096,7 @@
               <w:rPr>
                 <w:sz w:val="19"/>
               </w:rPr>
-              <w:t>[MSSV 4]</w:t>
+              <w:t>DE200235</w:t>
             </w:r>
           </w:p>
         </w:tc>
@@ -3089,7 +3126,133 @@
               <w:rPr>
                 <w:sz w:val="19"/>
               </w:rPr>
-              <w:t>Thực hiện ước lượng khoảng tin cậy, kiểm định giả thuyết (Câu 9 - 12, 1A, 1B)</w:t>
+              <w:t>Ước lượng mô hình hồi quy OLS, đánh giá R², sai số chuẩn s, thực hiện chẩn đoán giả định mô hình phần dư (Câu 6, 7, 8).</w:t>
+            </w:r>
+          </w:p>
+        </w:tc>
+      </w:tr>
+      <w:tr>
+        <w:trPr>
+          <w:cantSplit/>
+        </w:trPr>
+        <w:tc>
+          <w:tcPr>
+            <w:tcW w:type="dxa" w:w="2592"/>
+            <w:vAlign w:val="center"/>
+          </w:tcPr>
+          <w:p>
+            <w:r>
+              <w:rPr>
+                <w:sz w:val="19"/>
+              </w:rPr>
+              <w:t>Võ Ngọc Minh Quân</w:t>
+            </w:r>
+          </w:p>
+        </w:tc>
+        <w:tc>
+          <w:tcPr>
+            <w:tcW w:type="dxa" w:w="1728"/>
+            <w:vAlign w:val="center"/>
+          </w:tcPr>
+          <w:p>
+            <w:r>
+              <w:rPr>
+                <w:sz w:val="19"/>
+              </w:rPr>
+              <w:t>DE200080</w:t>
+            </w:r>
+          </w:p>
+        </w:tc>
+        <w:tc>
+          <w:tcPr>
+            <w:tcW w:type="dxa" w:w="1728"/>
+            <w:vAlign w:val="center"/>
+          </w:tcPr>
+          <w:p>
+            <w:r>
+              <w:rPr>
+                <w:sz w:val="19"/>
+              </w:rPr>
+              <w:t>Thành viên</w:t>
+            </w:r>
+          </w:p>
+        </w:tc>
+        <w:tc>
+          <w:tcPr>
+            <w:tcW w:type="dxa" w:w="4032"/>
+            <w:vAlign w:val="center"/>
+          </w:tcPr>
+          <w:p>
+            <w:r>
+              <w:rPr>
+                <w:sz w:val="19"/>
+              </w:rPr>
+              <w:t>Xây dựng khoảng tin cậy 95% cho trung bình và hệ số góc, kiểm định giả thuyết t một mẫu và hai phía (Câu 9, 10, 11, 12).</w:t>
+            </w:r>
+          </w:p>
+        </w:tc>
+      </w:tr>
+      <w:tr>
+        <w:trPr>
+          <w:cantSplit/>
+        </w:trPr>
+        <w:tc>
+          <w:tcPr>
+            <w:tcW w:type="dxa" w:w="2592"/>
+            <w:vAlign w:val="center"/>
+            <w:shd w:fill="F2F5F9"/>
+          </w:tcPr>
+          <w:p>
+            <w:r>
+              <w:rPr>
+                <w:sz w:val="19"/>
+              </w:rPr>
+              <w:t>Vũ Hữu Thái</w:t>
+            </w:r>
+          </w:p>
+        </w:tc>
+        <w:tc>
+          <w:tcPr>
+            <w:tcW w:type="dxa" w:w="1728"/>
+            <w:vAlign w:val="center"/>
+            <w:shd w:fill="F2F5F9"/>
+          </w:tcPr>
+          <w:p>
+            <w:r>
+              <w:rPr>
+                <w:sz w:val="19"/>
+              </w:rPr>
+              <w:t>DE200132</w:t>
+            </w:r>
+          </w:p>
+        </w:tc>
+        <w:tc>
+          <w:tcPr>
+            <w:tcW w:type="dxa" w:w="1728"/>
+            <w:vAlign w:val="center"/>
+            <w:shd w:fill="F2F5F9"/>
+          </w:tcPr>
+          <w:p>
+            <w:r>
+              <w:rPr>
+                <w:sz w:val="19"/>
+              </w:rPr>
+              <w:t>Thành viên</w:t>
+            </w:r>
+          </w:p>
+        </w:tc>
+        <w:tc>
+          <w:tcPr>
+            <w:tcW w:type="dxa" w:w="4032"/>
+            <w:vAlign w:val="center"/>
+            <w:shd w:fill="F2F5F9"/>
+          </w:tcPr>
+          <w:p>
+            <w:r>
+              <w:rPr>
+                <w:sz w:val="19"/>
+              </w:rPr>
+              <w:t>Thực hiện câu hỏi riêng 1A (dự đoán tại X=6, X=8) và 1B (phân tích giới hạn mô hình, biến số bị bỏ sót), kiểm thử phần mềm.</w:t>
             </w:r>
           </w:p>
         </w:tc>

</xml_diff>

<commit_message>
fix(roster): reorder team members 1 to 6 (1: Hiếu, 2: Sinh, 3: Quân, 4: Thái, 5: Thắng, 6: Duy)
</commit_message>
<xml_diff>
--- a/outputs/reports/Computer_Project_Topic_1_Report.docx
+++ b/outputs/reports/Computer_Project_Topic_1_Report.docx
@@ -215,15 +215,15 @@
               </w:rPr>
               <w:t>Mai Xuân Hiếu — DE200199 (Nhóm trưởng)</w:t>
               <w:br/>
-              <w:t>Nguyễn Hữu Hoàng Thắng — DE200281 (Thành viên)</w:t>
-              <w:br/>
-              <w:t>Trần Đức Duy — DE180206 (Thành viên)</w:t>
-              <w:br/>
               <w:t>Phan Dương Sinh — DE200235 (Thành viên)</w:t>
               <w:br/>
               <w:t>Võ Ngọc Minh Quân — DE200080 (Thành viên)</w:t>
               <w:br/>
               <w:t>Vũ Hữu Thái — DE200132 (Thành viên)</w:t>
+              <w:br/>
+              <w:t>Nguyễn Hữu Hoàng Thắng — DE200281 (Thành viên)</w:t>
+              <w:br/>
+              <w:t>Trần Đức Duy — DE180206 (Thành viên)</w:t>
             </w:r>
           </w:p>
         </w:tc>
@@ -2955,132 +2955,6 @@
               <w:rPr>
                 <w:sz w:val="19"/>
               </w:rPr>
-              <w:t>Nguyễn Hữu Hoàng Thắng</w:t>
-            </w:r>
-          </w:p>
-        </w:tc>
-        <w:tc>
-          <w:tcPr>
-            <w:tcW w:type="dxa" w:w="1728"/>
-            <w:vAlign w:val="center"/>
-            <w:shd w:fill="F2F5F9"/>
-          </w:tcPr>
-          <w:p>
-            <w:r>
-              <w:rPr>
-                <w:sz w:val="19"/>
-              </w:rPr>
-              <w:t>DE200281</w:t>
-            </w:r>
-          </w:p>
-        </w:tc>
-        <w:tc>
-          <w:tcPr>
-            <w:tcW w:type="dxa" w:w="1728"/>
-            <w:vAlign w:val="center"/>
-            <w:shd w:fill="F2F5F9"/>
-          </w:tcPr>
-          <w:p>
-            <w:r>
-              <w:rPr>
-                <w:sz w:val="19"/>
-              </w:rPr>
-              <w:t>Thành viên</w:t>
-            </w:r>
-          </w:p>
-        </w:tc>
-        <w:tc>
-          <w:tcPr>
-            <w:tcW w:type="dxa" w:w="4032"/>
-            <w:vAlign w:val="center"/>
-            <w:shd w:fill="F2F5F9"/>
-          </w:tcPr>
-          <w:p>
-            <w:r>
-              <w:rPr>
-                <w:sz w:val="19"/>
-              </w:rPr>
-              <w:t>Thu thập dữ liệu khảo sát ẩn danh, kiểm tra tính hợp lệ, viết module làm sạch dữ liệu và thống kê mô tả (Câu 1, 2, 3).</w:t>
-            </w:r>
-          </w:p>
-        </w:tc>
-      </w:tr>
-      <w:tr>
-        <w:trPr>
-          <w:cantSplit/>
-        </w:trPr>
-        <w:tc>
-          <w:tcPr>
-            <w:tcW w:type="dxa" w:w="2592"/>
-            <w:vAlign w:val="center"/>
-          </w:tcPr>
-          <w:p>
-            <w:r>
-              <w:rPr>
-                <w:sz w:val="19"/>
-              </w:rPr>
-              <w:t>Trần Đức Duy</w:t>
-            </w:r>
-          </w:p>
-        </w:tc>
-        <w:tc>
-          <w:tcPr>
-            <w:tcW w:type="dxa" w:w="1728"/>
-            <w:vAlign w:val="center"/>
-          </w:tcPr>
-          <w:p>
-            <w:r>
-              <w:rPr>
-                <w:sz w:val="19"/>
-              </w:rPr>
-              <w:t>DE180206</w:t>
-            </w:r>
-          </w:p>
-        </w:tc>
-        <w:tc>
-          <w:tcPr>
-            <w:tcW w:type="dxa" w:w="1728"/>
-            <w:vAlign w:val="center"/>
-          </w:tcPr>
-          <w:p>
-            <w:r>
-              <w:rPr>
-                <w:sz w:val="19"/>
-              </w:rPr>
-              <w:t>Thành viên</w:t>
-            </w:r>
-          </w:p>
-        </w:tc>
-        <w:tc>
-          <w:tcPr>
-            <w:tcW w:type="dxa" w:w="4032"/>
-            <w:vAlign w:val="center"/>
-          </w:tcPr>
-          <w:p>
-            <w:r>
-              <w:rPr>
-                <w:sz w:val="19"/>
-              </w:rPr>
-              <w:t>Vẽ đồ thị phân phối Histogram, Boxplot, phân tích ngoại lệ 1.5 IQR, tính tương quan Pearson và vẽ Scatterplot (Câu 4, 5).</w:t>
-            </w:r>
-          </w:p>
-        </w:tc>
-      </w:tr>
-      <w:tr>
-        <w:trPr>
-          <w:cantSplit/>
-        </w:trPr>
-        <w:tc>
-          <w:tcPr>
-            <w:tcW w:type="dxa" w:w="2592"/>
-            <w:vAlign w:val="center"/>
-            <w:shd w:fill="F2F5F9"/>
-          </w:tcPr>
-          <w:p>
-            <w:r>
-              <w:rPr>
-                <w:sz w:val="19"/>
-              </w:rPr>
               <w:t>Phan Dương Sinh</w:t>
             </w:r>
           </w:p>
@@ -3126,7 +3000,7 @@
               <w:rPr>
                 <w:sz w:val="19"/>
               </w:rPr>
-              <w:t>Ước lượng mô hình hồi quy OLS, đánh giá R², sai số chuẩn s, thực hiện chẩn đoán giả định mô hình phần dư (Câu 6, 7, 8).</w:t>
+              <w:t>Thu thập dữ liệu khảo sát ẩn danh, kiểm tra tính hợp lệ, viết module làm sạch dữ liệu và thống kê mô tả (Câu 1, 2, 3, 4).</w:t>
             </w:r>
           </w:p>
         </w:tc>
@@ -3187,7 +3061,7 @@
               <w:rPr>
                 <w:sz w:val="19"/>
               </w:rPr>
-              <w:t>Xây dựng khoảng tin cậy 95% cho trung bình và hệ số góc, kiểm định giả thuyết t một mẫu và hai phía (Câu 9, 10, 11, 12).</w:t>
+              <w:t>Vẽ đồ thị phân phối Histogram, Boxplot, phân tích ngoại lệ 1.5 IQR, tính tương quan Pearson và vẽ Scatterplot, hồi quy OLS (Câu 4, 5, 6, 7).</w:t>
             </w:r>
           </w:p>
         </w:tc>
@@ -3252,7 +3126,133 @@
               <w:rPr>
                 <w:sz w:val="19"/>
               </w:rPr>
-              <w:t>Thực hiện câu hỏi riêng 1A (dự đoán tại X=6, X=8) và 1B (phân tích giới hạn mô hình, biến số bị bỏ sót), kiểm thử phần mềm.</w:t>
+              <w:t>Ước lượng mô hình hồi quy OLS, đánh giá R², sai số chuẩn s, thực hiện chẩn đoán giả định mô hình phần dư (Câu 6, 7, 8).</w:t>
+            </w:r>
+          </w:p>
+        </w:tc>
+      </w:tr>
+      <w:tr>
+        <w:trPr>
+          <w:cantSplit/>
+        </w:trPr>
+        <w:tc>
+          <w:tcPr>
+            <w:tcW w:type="dxa" w:w="2592"/>
+            <w:vAlign w:val="center"/>
+          </w:tcPr>
+          <w:p>
+            <w:r>
+              <w:rPr>
+                <w:sz w:val="19"/>
+              </w:rPr>
+              <w:t>Nguyễn Hữu Hoàng Thắng</w:t>
+            </w:r>
+          </w:p>
+        </w:tc>
+        <w:tc>
+          <w:tcPr>
+            <w:tcW w:type="dxa" w:w="1728"/>
+            <w:vAlign w:val="center"/>
+          </w:tcPr>
+          <w:p>
+            <w:r>
+              <w:rPr>
+                <w:sz w:val="19"/>
+              </w:rPr>
+              <w:t>DE200281</w:t>
+            </w:r>
+          </w:p>
+        </w:tc>
+        <w:tc>
+          <w:tcPr>
+            <w:tcW w:type="dxa" w:w="1728"/>
+            <w:vAlign w:val="center"/>
+          </w:tcPr>
+          <w:p>
+            <w:r>
+              <w:rPr>
+                <w:sz w:val="19"/>
+              </w:rPr>
+              <w:t>Thành viên</w:t>
+            </w:r>
+          </w:p>
+        </w:tc>
+        <w:tc>
+          <w:tcPr>
+            <w:tcW w:type="dxa" w:w="4032"/>
+            <w:vAlign w:val="center"/>
+          </w:tcPr>
+          <w:p>
+            <w:r>
+              <w:rPr>
+                <w:sz w:val="19"/>
+              </w:rPr>
+              <w:t>Xây dựng khoảng tin cậy 95% cho trung bình và hệ số góc, kiểm định giả thuyết t một mẫu và hai phía (Câu 9, 10, 11, 12).</w:t>
+            </w:r>
+          </w:p>
+        </w:tc>
+      </w:tr>
+      <w:tr>
+        <w:trPr>
+          <w:cantSplit/>
+        </w:trPr>
+        <w:tc>
+          <w:tcPr>
+            <w:tcW w:type="dxa" w:w="2592"/>
+            <w:vAlign w:val="center"/>
+            <w:shd w:fill="F2F5F9"/>
+          </w:tcPr>
+          <w:p>
+            <w:r>
+              <w:rPr>
+                <w:sz w:val="19"/>
+              </w:rPr>
+              <w:t>Trần Đức Duy</w:t>
+            </w:r>
+          </w:p>
+        </w:tc>
+        <w:tc>
+          <w:tcPr>
+            <w:tcW w:type="dxa" w:w="1728"/>
+            <w:vAlign w:val="center"/>
+            <w:shd w:fill="F2F5F9"/>
+          </w:tcPr>
+          <w:p>
+            <w:r>
+              <w:rPr>
+                <w:sz w:val="19"/>
+              </w:rPr>
+              <w:t>DE180206</w:t>
+            </w:r>
+          </w:p>
+        </w:tc>
+        <w:tc>
+          <w:tcPr>
+            <w:tcW w:type="dxa" w:w="1728"/>
+            <w:vAlign w:val="center"/>
+            <w:shd w:fill="F2F5F9"/>
+          </w:tcPr>
+          <w:p>
+            <w:r>
+              <w:rPr>
+                <w:sz w:val="19"/>
+              </w:rPr>
+              <w:t>Thành viên</w:t>
+            </w:r>
+          </w:p>
+        </w:tc>
+        <w:tc>
+          <w:tcPr>
+            <w:tcW w:type="dxa" w:w="4032"/>
+            <w:vAlign w:val="center"/>
+            <w:shd w:fill="F2F5F9"/>
+          </w:tcPr>
+          <w:p>
+            <w:r>
+              <w:rPr>
+                <w:sz w:val="19"/>
+              </w:rPr>
+              <w:t>Thực hiện câu hỏi riêng 1A (dự đoán tại X=6, X=8) và 1B (phân tích giới hạn mô hình, biến số bị bỏ sót), tổng kết báo cáo.</w:t>
             </w:r>
           </w:p>
         </w:tc>

</xml_diff>

<commit_message>
feat: package all 5 deliverables into master submission bundle and comprehensive excel workbook
</commit_message>
<xml_diff>
--- a/outputs/reports/Computer_Project_Topic_1_Report.docx
+++ b/outputs/reports/Computer_Project_Topic_1_Report.docx
@@ -3258,6 +3258,2775 @@
         </w:tc>
       </w:tr>
     </w:tbl>
+    <w:p>
+      <w:pPr>
+        <w:pStyle w:val="Heading2"/>
+      </w:pPr>
+      <w:r>
+        <w:br/>
+        <w:t>Phụ lục C. Tập dữ liệu nghiên cứu chính thức (n = 32 quan sát đã làm sạch, ẩn danh)</w:t>
+      </w:r>
+    </w:p>
+    <w:p>
+      <w:r>
+        <w:t>Tập dữ liệu bao gồm 32 cặp điểm thi của cùng một sinh viên độc lập, đã loại bỏ toàn bộ thông tin nhận diện cá nhân (PII), tuân thủ nghiêm ngặt chuẩn đạo đức nghiên cứu khoa học:</w:t>
+      </w:r>
+    </w:p>
+    <w:tbl>
+      <w:tblPr>
+        <w:tblW w:type="auto" w:w="0"/>
+        <w:jc w:val="center"/>
+        <w:tblLook w:firstColumn="1" w:firstRow="1" w:lastColumn="0" w:lastRow="0" w:noHBand="0" w:noVBand="1" w:val="04A0"/>
+      </w:tblPr>
+      <w:tblGrid>
+        <w:gridCol w:w="1170"/>
+        <w:gridCol w:w="1170"/>
+        <w:gridCol w:w="1170"/>
+        <w:gridCol w:w="1170"/>
+        <w:gridCol w:w="1170"/>
+        <w:gridCol w:w="1170"/>
+        <w:gridCol w:w="1170"/>
+        <w:gridCol w:w="1170"/>
+      </w:tblGrid>
+      <w:tr>
+        <w:trPr>
+          <w:cantSplit/>
+          <w:tblHeader/>
+        </w:trPr>
+        <w:tc>
+          <w:tcPr>
+            <w:tcW w:type="dxa" w:w="864"/>
+            <w:vAlign w:val="center"/>
+            <w:shd w:fill="1F497D"/>
+          </w:tcPr>
+          <w:p>
+            <w:pPr>
+              <w:jc w:val="center"/>
+            </w:pPr>
+            <w:r>
+              <w:rPr>
+                <w:b/>
+                <w:color w:val="FFFFFF"/>
+                <w:sz w:val="20"/>
+              </w:rPr>
+              <w:t>STT</w:t>
+            </w:r>
+          </w:p>
+        </w:tc>
+        <w:tc>
+          <w:tcPr>
+            <w:tcW w:type="dxa" w:w="1584"/>
+            <w:vAlign w:val="center"/>
+            <w:shd w:fill="1F497D"/>
+          </w:tcPr>
+          <w:p>
+            <w:pPr>
+              <w:jc w:val="center"/>
+            </w:pPr>
+            <w:r>
+              <w:rPr>
+                <w:b/>
+                <w:color w:val="FFFFFF"/>
+                <w:sz w:val="20"/>
+              </w:rPr>
+              <w:t>Mã ẩn danh</w:t>
+            </w:r>
+          </w:p>
+        </w:tc>
+        <w:tc>
+          <w:tcPr>
+            <w:tcW w:type="dxa" w:w="1440"/>
+            <w:vAlign w:val="center"/>
+            <w:shd w:fill="1F497D"/>
+          </w:tcPr>
+          <w:p>
+            <w:pPr>
+              <w:jc w:val="center"/>
+            </w:pPr>
+            <w:r>
+              <w:rPr>
+                <w:b/>
+                <w:color w:val="FFFFFF"/>
+                <w:sz w:val="20"/>
+              </w:rPr>
+              <w:t>Điểm GK (X)</w:t>
+            </w:r>
+          </w:p>
+        </w:tc>
+        <w:tc>
+          <w:tcPr>
+            <w:tcW w:type="dxa" w:w="1440"/>
+            <w:vAlign w:val="center"/>
+            <w:shd w:fill="1F497D"/>
+          </w:tcPr>
+          <w:p>
+            <w:pPr>
+              <w:jc w:val="center"/>
+            </w:pPr>
+            <w:r>
+              <w:rPr>
+                <w:b/>
+                <w:color w:val="FFFFFF"/>
+                <w:sz w:val="20"/>
+              </w:rPr>
+              <w:t>Điểm CK (Y)</w:t>
+            </w:r>
+          </w:p>
+        </w:tc>
+        <w:tc>
+          <w:tcPr>
+            <w:tcW w:type="dxa" w:w="864"/>
+            <w:vAlign w:val="center"/>
+            <w:shd w:fill="1F497D"/>
+          </w:tcPr>
+          <w:p>
+            <w:pPr>
+              <w:jc w:val="center"/>
+            </w:pPr>
+            <w:r>
+              <w:rPr>
+                <w:b/>
+                <w:color w:val="FFFFFF"/>
+                <w:sz w:val="20"/>
+              </w:rPr>
+              <w:t>STT</w:t>
+            </w:r>
+          </w:p>
+        </w:tc>
+        <w:tc>
+          <w:tcPr>
+            <w:tcW w:type="dxa" w:w="1584"/>
+            <w:vAlign w:val="center"/>
+            <w:shd w:fill="1F497D"/>
+          </w:tcPr>
+          <w:p>
+            <w:pPr>
+              <w:jc w:val="center"/>
+            </w:pPr>
+            <w:r>
+              <w:rPr>
+                <w:b/>
+                <w:color w:val="FFFFFF"/>
+                <w:sz w:val="20"/>
+              </w:rPr>
+              <w:t>Mã ẩn danh</w:t>
+            </w:r>
+          </w:p>
+        </w:tc>
+        <w:tc>
+          <w:tcPr>
+            <w:tcW w:type="dxa" w:w="1440"/>
+            <w:vAlign w:val="center"/>
+            <w:shd w:fill="1F497D"/>
+          </w:tcPr>
+          <w:p>
+            <w:pPr>
+              <w:jc w:val="center"/>
+            </w:pPr>
+            <w:r>
+              <w:rPr>
+                <w:b/>
+                <w:color w:val="FFFFFF"/>
+                <w:sz w:val="20"/>
+              </w:rPr>
+              <w:t>Điểm GK (X)</w:t>
+            </w:r>
+          </w:p>
+        </w:tc>
+        <w:tc>
+          <w:tcPr>
+            <w:tcW w:type="dxa" w:w="1440"/>
+            <w:vAlign w:val="center"/>
+            <w:shd w:fill="1F497D"/>
+          </w:tcPr>
+          <w:p>
+            <w:pPr>
+              <w:jc w:val="center"/>
+            </w:pPr>
+            <w:r>
+              <w:rPr>
+                <w:b/>
+                <w:color w:val="FFFFFF"/>
+                <w:sz w:val="20"/>
+              </w:rPr>
+              <w:t>Điểm CK (Y)</w:t>
+            </w:r>
+          </w:p>
+        </w:tc>
+      </w:tr>
+      <w:tr>
+        <w:trPr>
+          <w:cantSplit/>
+        </w:trPr>
+        <w:tc>
+          <w:tcPr>
+            <w:tcW w:type="dxa" w:w="864"/>
+            <w:vAlign w:val="center"/>
+          </w:tcPr>
+          <w:p>
+            <w:r>
+              <w:rPr>
+                <w:sz w:val="19"/>
+              </w:rPr>
+              <w:t>1</w:t>
+            </w:r>
+          </w:p>
+        </w:tc>
+        <w:tc>
+          <w:tcPr>
+            <w:tcW w:type="dxa" w:w="1584"/>
+            <w:vAlign w:val="center"/>
+          </w:tcPr>
+          <w:p>
+            <w:r>
+              <w:rPr>
+                <w:sz w:val="19"/>
+              </w:rPr>
+              <w:t>DE200125</w:t>
+            </w:r>
+          </w:p>
+        </w:tc>
+        <w:tc>
+          <w:tcPr>
+            <w:tcW w:type="dxa" w:w="1440"/>
+            <w:vAlign w:val="center"/>
+          </w:tcPr>
+          <w:p>
+            <w:r>
+              <w:rPr>
+                <w:sz w:val="19"/>
+              </w:rPr>
+              <w:t>8.0</w:t>
+            </w:r>
+          </w:p>
+        </w:tc>
+        <w:tc>
+          <w:tcPr>
+            <w:tcW w:type="dxa" w:w="1440"/>
+            <w:vAlign w:val="center"/>
+          </w:tcPr>
+          <w:p>
+            <w:r>
+              <w:rPr>
+                <w:sz w:val="19"/>
+              </w:rPr>
+              <w:t>7.9</w:t>
+            </w:r>
+          </w:p>
+        </w:tc>
+        <w:tc>
+          <w:tcPr>
+            <w:tcW w:type="dxa" w:w="864"/>
+            <w:vAlign w:val="center"/>
+          </w:tcPr>
+          <w:p>
+            <w:r>
+              <w:rPr>
+                <w:sz w:val="19"/>
+              </w:rPr>
+              <w:t>17</w:t>
+            </w:r>
+          </w:p>
+        </w:tc>
+        <w:tc>
+          <w:tcPr>
+            <w:tcW w:type="dxa" w:w="1584"/>
+            <w:vAlign w:val="center"/>
+          </w:tcPr>
+          <w:p>
+            <w:r>
+              <w:rPr>
+                <w:sz w:val="19"/>
+              </w:rPr>
+              <w:t>ketao</w:t>
+            </w:r>
+          </w:p>
+        </w:tc>
+        <w:tc>
+          <w:tcPr>
+            <w:tcW w:type="dxa" w:w="1440"/>
+            <w:vAlign w:val="center"/>
+          </w:tcPr>
+          <w:p>
+            <w:r>
+              <w:rPr>
+                <w:sz w:val="19"/>
+              </w:rPr>
+              <w:t>6.0</w:t>
+            </w:r>
+          </w:p>
+        </w:tc>
+        <w:tc>
+          <w:tcPr>
+            <w:tcW w:type="dxa" w:w="1440"/>
+            <w:vAlign w:val="center"/>
+          </w:tcPr>
+          <w:p>
+            <w:r>
+              <w:rPr>
+                <w:sz w:val="19"/>
+              </w:rPr>
+              <w:t>9.0</w:t>
+            </w:r>
+          </w:p>
+        </w:tc>
+      </w:tr>
+      <w:tr>
+        <w:trPr>
+          <w:cantSplit/>
+        </w:trPr>
+        <w:tc>
+          <w:tcPr>
+            <w:tcW w:type="dxa" w:w="864"/>
+            <w:vAlign w:val="center"/>
+            <w:shd w:fill="F2F5F9"/>
+          </w:tcPr>
+          <w:p>
+            <w:r>
+              <w:rPr>
+                <w:sz w:val="19"/>
+              </w:rPr>
+              <w:t>2</w:t>
+            </w:r>
+          </w:p>
+        </w:tc>
+        <w:tc>
+          <w:tcPr>
+            <w:tcW w:type="dxa" w:w="1584"/>
+            <w:vAlign w:val="center"/>
+            <w:shd w:fill="F2F5F9"/>
+          </w:tcPr>
+          <w:p>
+            <w:r>
+              <w:rPr>
+                <w:sz w:val="19"/>
+              </w:rPr>
+              <w:t>DE200377</w:t>
+            </w:r>
+          </w:p>
+        </w:tc>
+        <w:tc>
+          <w:tcPr>
+            <w:tcW w:type="dxa" w:w="1440"/>
+            <w:vAlign w:val="center"/>
+            <w:shd w:fill="F2F5F9"/>
+          </w:tcPr>
+          <w:p>
+            <w:r>
+              <w:rPr>
+                <w:sz w:val="19"/>
+              </w:rPr>
+              <w:t>8.0</w:t>
+            </w:r>
+          </w:p>
+        </w:tc>
+        <w:tc>
+          <w:tcPr>
+            <w:tcW w:type="dxa" w:w="1440"/>
+            <w:vAlign w:val="center"/>
+            <w:shd w:fill="F2F5F9"/>
+          </w:tcPr>
+          <w:p>
+            <w:r>
+              <w:rPr>
+                <w:sz w:val="19"/>
+              </w:rPr>
+              <w:t>8.0</w:t>
+            </w:r>
+          </w:p>
+        </w:tc>
+        <w:tc>
+          <w:tcPr>
+            <w:tcW w:type="dxa" w:w="864"/>
+            <w:vAlign w:val="center"/>
+            <w:shd w:fill="F2F5F9"/>
+          </w:tcPr>
+          <w:p>
+            <w:r>
+              <w:rPr>
+                <w:sz w:val="19"/>
+              </w:rPr>
+              <w:t>18</w:t>
+            </w:r>
+          </w:p>
+        </w:tc>
+        <w:tc>
+          <w:tcPr>
+            <w:tcW w:type="dxa" w:w="1584"/>
+            <w:vAlign w:val="center"/>
+            <w:shd w:fill="F2F5F9"/>
+          </w:tcPr>
+          <w:p>
+            <w:r>
+              <w:rPr>
+                <w:sz w:val="19"/>
+              </w:rPr>
+              <w:t>0131</w:t>
+            </w:r>
+          </w:p>
+        </w:tc>
+        <w:tc>
+          <w:tcPr>
+            <w:tcW w:type="dxa" w:w="1440"/>
+            <w:vAlign w:val="center"/>
+            <w:shd w:fill="F2F5F9"/>
+          </w:tcPr>
+          <w:p>
+            <w:r>
+              <w:rPr>
+                <w:sz w:val="19"/>
+              </w:rPr>
+              <w:t>9.3</w:t>
+            </w:r>
+          </w:p>
+        </w:tc>
+        <w:tc>
+          <w:tcPr>
+            <w:tcW w:type="dxa" w:w="1440"/>
+            <w:vAlign w:val="center"/>
+            <w:shd w:fill="F2F5F9"/>
+          </w:tcPr>
+          <w:p>
+            <w:r>
+              <w:rPr>
+                <w:sz w:val="19"/>
+              </w:rPr>
+              <w:t>8.5</w:t>
+            </w:r>
+          </w:p>
+        </w:tc>
+      </w:tr>
+      <w:tr>
+        <w:trPr>
+          <w:cantSplit/>
+        </w:trPr>
+        <w:tc>
+          <w:tcPr>
+            <w:tcW w:type="dxa" w:w="864"/>
+            <w:vAlign w:val="center"/>
+          </w:tcPr>
+          <w:p>
+            <w:r>
+              <w:rPr>
+                <w:sz w:val="19"/>
+              </w:rPr>
+              <w:t>3</w:t>
+            </w:r>
+          </w:p>
+        </w:tc>
+        <w:tc>
+          <w:tcPr>
+            <w:tcW w:type="dxa" w:w="1584"/>
+            <w:vAlign w:val="center"/>
+          </w:tcPr>
+          <w:p>
+            <w:r>
+              <w:rPr>
+                <w:sz w:val="19"/>
+              </w:rPr>
+              <w:t>0136</w:t>
+            </w:r>
+          </w:p>
+        </w:tc>
+        <w:tc>
+          <w:tcPr>
+            <w:tcW w:type="dxa" w:w="1440"/>
+            <w:vAlign w:val="center"/>
+          </w:tcPr>
+          <w:p>
+            <w:r>
+              <w:rPr>
+                <w:sz w:val="19"/>
+              </w:rPr>
+              <w:t>8.0</w:t>
+            </w:r>
+          </w:p>
+        </w:tc>
+        <w:tc>
+          <w:tcPr>
+            <w:tcW w:type="dxa" w:w="1440"/>
+            <w:vAlign w:val="center"/>
+          </w:tcPr>
+          <w:p>
+            <w:r>
+              <w:rPr>
+                <w:sz w:val="19"/>
+              </w:rPr>
+              <w:t>8.0</w:t>
+            </w:r>
+          </w:p>
+        </w:tc>
+        <w:tc>
+          <w:tcPr>
+            <w:tcW w:type="dxa" w:w="864"/>
+            <w:vAlign w:val="center"/>
+          </w:tcPr>
+          <w:p>
+            <w:r>
+              <w:rPr>
+                <w:sz w:val="19"/>
+              </w:rPr>
+              <w:t>19</w:t>
+            </w:r>
+          </w:p>
+        </w:tc>
+        <w:tc>
+          <w:tcPr>
+            <w:tcW w:type="dxa" w:w="1584"/>
+            <w:vAlign w:val="center"/>
+          </w:tcPr>
+          <w:p>
+            <w:r>
+              <w:rPr>
+                <w:sz w:val="19"/>
+              </w:rPr>
+              <w:t>Mai</w:t>
+            </w:r>
+          </w:p>
+        </w:tc>
+        <w:tc>
+          <w:tcPr>
+            <w:tcW w:type="dxa" w:w="1440"/>
+            <w:vAlign w:val="center"/>
+          </w:tcPr>
+          <w:p>
+            <w:r>
+              <w:rPr>
+                <w:sz w:val="19"/>
+              </w:rPr>
+              <w:t>8.5</w:t>
+            </w:r>
+          </w:p>
+        </w:tc>
+        <w:tc>
+          <w:tcPr>
+            <w:tcW w:type="dxa" w:w="1440"/>
+            <w:vAlign w:val="center"/>
+          </w:tcPr>
+          <w:p>
+            <w:r>
+              <w:rPr>
+                <w:sz w:val="19"/>
+              </w:rPr>
+              <w:t>9.5</w:t>
+            </w:r>
+          </w:p>
+        </w:tc>
+      </w:tr>
+      <w:tr>
+        <w:trPr>
+          <w:cantSplit/>
+        </w:trPr>
+        <w:tc>
+          <w:tcPr>
+            <w:tcW w:type="dxa" w:w="864"/>
+            <w:vAlign w:val="center"/>
+            <w:shd w:fill="F2F5F9"/>
+          </w:tcPr>
+          <w:p>
+            <w:r>
+              <w:rPr>
+                <w:sz w:val="19"/>
+              </w:rPr>
+              <w:t>4</w:t>
+            </w:r>
+          </w:p>
+        </w:tc>
+        <w:tc>
+          <w:tcPr>
+            <w:tcW w:type="dxa" w:w="1584"/>
+            <w:vAlign w:val="center"/>
+            <w:shd w:fill="F2F5F9"/>
+          </w:tcPr>
+          <w:p>
+            <w:r>
+              <w:rPr>
+                <w:sz w:val="19"/>
+              </w:rPr>
+              <w:t>Su</w:t>
+            </w:r>
+          </w:p>
+        </w:tc>
+        <w:tc>
+          <w:tcPr>
+            <w:tcW w:type="dxa" w:w="1440"/>
+            <w:vAlign w:val="center"/>
+            <w:shd w:fill="F2F5F9"/>
+          </w:tcPr>
+          <w:p>
+            <w:r>
+              <w:rPr>
+                <w:sz w:val="19"/>
+              </w:rPr>
+              <w:t>9.0</w:t>
+            </w:r>
+          </w:p>
+        </w:tc>
+        <w:tc>
+          <w:tcPr>
+            <w:tcW w:type="dxa" w:w="1440"/>
+            <w:vAlign w:val="center"/>
+            <w:shd w:fill="F2F5F9"/>
+          </w:tcPr>
+          <w:p>
+            <w:r>
+              <w:rPr>
+                <w:sz w:val="19"/>
+              </w:rPr>
+              <w:t>8.0</w:t>
+            </w:r>
+          </w:p>
+        </w:tc>
+        <w:tc>
+          <w:tcPr>
+            <w:tcW w:type="dxa" w:w="864"/>
+            <w:vAlign w:val="center"/>
+            <w:shd w:fill="F2F5F9"/>
+          </w:tcPr>
+          <w:p>
+            <w:r>
+              <w:rPr>
+                <w:sz w:val="19"/>
+              </w:rPr>
+              <w:t>20</w:t>
+            </w:r>
+          </w:p>
+        </w:tc>
+        <w:tc>
+          <w:tcPr>
+            <w:tcW w:type="dxa" w:w="1584"/>
+            <w:vAlign w:val="center"/>
+            <w:shd w:fill="F2F5F9"/>
+          </w:tcPr>
+          <w:p>
+            <w:r>
+              <w:rPr>
+                <w:sz w:val="19"/>
+              </w:rPr>
+              <w:t>DE200134/ meo meo</w:t>
+            </w:r>
+          </w:p>
+        </w:tc>
+        <w:tc>
+          <w:tcPr>
+            <w:tcW w:type="dxa" w:w="1440"/>
+            <w:vAlign w:val="center"/>
+            <w:shd w:fill="F2F5F9"/>
+          </w:tcPr>
+          <w:p>
+            <w:r>
+              <w:rPr>
+                <w:sz w:val="19"/>
+              </w:rPr>
+              <w:t>7.5</w:t>
+            </w:r>
+          </w:p>
+        </w:tc>
+        <w:tc>
+          <w:tcPr>
+            <w:tcW w:type="dxa" w:w="1440"/>
+            <w:vAlign w:val="center"/>
+            <w:shd w:fill="F2F5F9"/>
+          </w:tcPr>
+          <w:p>
+            <w:r>
+              <w:rPr>
+                <w:sz w:val="19"/>
+              </w:rPr>
+              <w:t>8.0</w:t>
+            </w:r>
+          </w:p>
+        </w:tc>
+      </w:tr>
+      <w:tr>
+        <w:trPr>
+          <w:cantSplit/>
+        </w:trPr>
+        <w:tc>
+          <w:tcPr>
+            <w:tcW w:type="dxa" w:w="864"/>
+            <w:vAlign w:val="center"/>
+          </w:tcPr>
+          <w:p>
+            <w:r>
+              <w:rPr>
+                <w:sz w:val="19"/>
+              </w:rPr>
+              <w:t>5</w:t>
+            </w:r>
+          </w:p>
+        </w:tc>
+        <w:tc>
+          <w:tcPr>
+            <w:tcW w:type="dxa" w:w="1584"/>
+            <w:vAlign w:val="center"/>
+          </w:tcPr>
+          <w:p>
+            <w:r>
+              <w:rPr>
+                <w:sz w:val="19"/>
+              </w:rPr>
+              <w:t>TTL</w:t>
+            </w:r>
+          </w:p>
+        </w:tc>
+        <w:tc>
+          <w:tcPr>
+            <w:tcW w:type="dxa" w:w="1440"/>
+            <w:vAlign w:val="center"/>
+          </w:tcPr>
+          <w:p>
+            <w:r>
+              <w:rPr>
+                <w:sz w:val="19"/>
+              </w:rPr>
+              <w:t>5.0</w:t>
+            </w:r>
+          </w:p>
+        </w:tc>
+        <w:tc>
+          <w:tcPr>
+            <w:tcW w:type="dxa" w:w="1440"/>
+            <w:vAlign w:val="center"/>
+          </w:tcPr>
+          <w:p>
+            <w:r>
+              <w:rPr>
+                <w:sz w:val="19"/>
+              </w:rPr>
+              <w:t>6.0</w:t>
+            </w:r>
+          </w:p>
+        </w:tc>
+        <w:tc>
+          <w:tcPr>
+            <w:tcW w:type="dxa" w:w="864"/>
+            <w:vAlign w:val="center"/>
+          </w:tcPr>
+          <w:p>
+            <w:r>
+              <w:rPr>
+                <w:sz w:val="19"/>
+              </w:rPr>
+              <w:t>21</w:t>
+            </w:r>
+          </w:p>
+        </w:tc>
+        <w:tc>
+          <w:tcPr>
+            <w:tcW w:type="dxa" w:w="1584"/>
+            <w:vAlign w:val="center"/>
+          </w:tcPr>
+          <w:p>
+            <w:r>
+              <w:rPr>
+                <w:sz w:val="19"/>
+              </w:rPr>
+              <w:t>D200143</w:t>
+            </w:r>
+          </w:p>
+        </w:tc>
+        <w:tc>
+          <w:tcPr>
+            <w:tcW w:type="dxa" w:w="1440"/>
+            <w:vAlign w:val="center"/>
+          </w:tcPr>
+          <w:p>
+            <w:r>
+              <w:rPr>
+                <w:sz w:val="19"/>
+              </w:rPr>
+              <w:t>6.0</w:t>
+            </w:r>
+          </w:p>
+        </w:tc>
+        <w:tc>
+          <w:tcPr>
+            <w:tcW w:type="dxa" w:w="1440"/>
+            <w:vAlign w:val="center"/>
+          </w:tcPr>
+          <w:p>
+            <w:r>
+              <w:rPr>
+                <w:sz w:val="19"/>
+              </w:rPr>
+              <w:t>7.0</w:t>
+            </w:r>
+          </w:p>
+        </w:tc>
+      </w:tr>
+      <w:tr>
+        <w:trPr>
+          <w:cantSplit/>
+        </w:trPr>
+        <w:tc>
+          <w:tcPr>
+            <w:tcW w:type="dxa" w:w="864"/>
+            <w:vAlign w:val="center"/>
+            <w:shd w:fill="F2F5F9"/>
+          </w:tcPr>
+          <w:p>
+            <w:r>
+              <w:rPr>
+                <w:sz w:val="19"/>
+              </w:rPr>
+              <w:t>6</w:t>
+            </w:r>
+          </w:p>
+        </w:tc>
+        <w:tc>
+          <w:tcPr>
+            <w:tcW w:type="dxa" w:w="1584"/>
+            <w:vAlign w:val="center"/>
+            <w:shd w:fill="F2F5F9"/>
+          </w:tcPr>
+          <w:p>
+            <w:r>
+              <w:rPr>
+                <w:sz w:val="19"/>
+              </w:rPr>
+              <w:t>0019</w:t>
+            </w:r>
+          </w:p>
+        </w:tc>
+        <w:tc>
+          <w:tcPr>
+            <w:tcW w:type="dxa" w:w="1440"/>
+            <w:vAlign w:val="center"/>
+            <w:shd w:fill="F2F5F9"/>
+          </w:tcPr>
+          <w:p>
+            <w:r>
+              <w:rPr>
+                <w:sz w:val="19"/>
+              </w:rPr>
+              <w:t>6.8</w:t>
+            </w:r>
+          </w:p>
+        </w:tc>
+        <w:tc>
+          <w:tcPr>
+            <w:tcW w:type="dxa" w:w="1440"/>
+            <w:vAlign w:val="center"/>
+            <w:shd w:fill="F2F5F9"/>
+          </w:tcPr>
+          <w:p>
+            <w:r>
+              <w:rPr>
+                <w:sz w:val="19"/>
+              </w:rPr>
+              <w:t>7.0</w:t>
+            </w:r>
+          </w:p>
+        </w:tc>
+        <w:tc>
+          <w:tcPr>
+            <w:tcW w:type="dxa" w:w="864"/>
+            <w:vAlign w:val="center"/>
+            <w:shd w:fill="F2F5F9"/>
+          </w:tcPr>
+          <w:p>
+            <w:r>
+              <w:rPr>
+                <w:sz w:val="19"/>
+              </w:rPr>
+              <w:t>22</w:t>
+            </w:r>
+          </w:p>
+        </w:tc>
+        <w:tc>
+          <w:tcPr>
+            <w:tcW w:type="dxa" w:w="1584"/>
+            <w:vAlign w:val="center"/>
+            <w:shd w:fill="F2F5F9"/>
+          </w:tcPr>
+          <w:p>
+            <w:r>
+              <w:rPr>
+                <w:sz w:val="19"/>
+              </w:rPr>
+              <w:t>1020</w:t>
+            </w:r>
+          </w:p>
+        </w:tc>
+        <w:tc>
+          <w:tcPr>
+            <w:tcW w:type="dxa" w:w="1440"/>
+            <w:vAlign w:val="center"/>
+            <w:shd w:fill="F2F5F9"/>
+          </w:tcPr>
+          <w:p>
+            <w:r>
+              <w:rPr>
+                <w:sz w:val="19"/>
+              </w:rPr>
+              <w:t>8.5</w:t>
+            </w:r>
+          </w:p>
+        </w:tc>
+        <w:tc>
+          <w:tcPr>
+            <w:tcW w:type="dxa" w:w="1440"/>
+            <w:vAlign w:val="center"/>
+            <w:shd w:fill="F2F5F9"/>
+          </w:tcPr>
+          <w:p>
+            <w:r>
+              <w:rPr>
+                <w:sz w:val="19"/>
+              </w:rPr>
+              <w:t>8.2</w:t>
+            </w:r>
+          </w:p>
+        </w:tc>
+      </w:tr>
+      <w:tr>
+        <w:trPr>
+          <w:cantSplit/>
+        </w:trPr>
+        <w:tc>
+          <w:tcPr>
+            <w:tcW w:type="dxa" w:w="864"/>
+            <w:vAlign w:val="center"/>
+          </w:tcPr>
+          <w:p>
+            <w:r>
+              <w:rPr>
+                <w:sz w:val="19"/>
+              </w:rPr>
+              <w:t>7</w:t>
+            </w:r>
+          </w:p>
+        </w:tc>
+        <w:tc>
+          <w:tcPr>
+            <w:tcW w:type="dxa" w:w="1584"/>
+            <w:vAlign w:val="center"/>
+          </w:tcPr>
+          <w:p>
+            <w:r>
+              <w:rPr>
+                <w:sz w:val="19"/>
+              </w:rPr>
+              <w:t>0025-Rin</w:t>
+            </w:r>
+          </w:p>
+        </w:tc>
+        <w:tc>
+          <w:tcPr>
+            <w:tcW w:type="dxa" w:w="1440"/>
+            <w:vAlign w:val="center"/>
+          </w:tcPr>
+          <w:p>
+            <w:r>
+              <w:rPr>
+                <w:sz w:val="19"/>
+              </w:rPr>
+              <w:t>8.0</w:t>
+            </w:r>
+          </w:p>
+        </w:tc>
+        <w:tc>
+          <w:tcPr>
+            <w:tcW w:type="dxa" w:w="1440"/>
+            <w:vAlign w:val="center"/>
+          </w:tcPr>
+          <w:p>
+            <w:r>
+              <w:rPr>
+                <w:sz w:val="19"/>
+              </w:rPr>
+              <w:t>6.5</w:t>
+            </w:r>
+          </w:p>
+        </w:tc>
+        <w:tc>
+          <w:tcPr>
+            <w:tcW w:type="dxa" w:w="864"/>
+            <w:vAlign w:val="center"/>
+          </w:tcPr>
+          <w:p>
+            <w:r>
+              <w:rPr>
+                <w:sz w:val="19"/>
+              </w:rPr>
+              <w:t>23</w:t>
+            </w:r>
+          </w:p>
+        </w:tc>
+        <w:tc>
+          <w:tcPr>
+            <w:tcW w:type="dxa" w:w="1584"/>
+            <w:vAlign w:val="center"/>
+          </w:tcPr>
+          <w:p>
+            <w:r>
+              <w:rPr>
+                <w:sz w:val="19"/>
+              </w:rPr>
+              <w:t>0270</w:t>
+            </w:r>
+          </w:p>
+        </w:tc>
+        <w:tc>
+          <w:tcPr>
+            <w:tcW w:type="dxa" w:w="1440"/>
+            <w:vAlign w:val="center"/>
+          </w:tcPr>
+          <w:p>
+            <w:r>
+              <w:rPr>
+                <w:sz w:val="19"/>
+              </w:rPr>
+              <w:t>7.5</w:t>
+            </w:r>
+          </w:p>
+        </w:tc>
+        <w:tc>
+          <w:tcPr>
+            <w:tcW w:type="dxa" w:w="1440"/>
+            <w:vAlign w:val="center"/>
+          </w:tcPr>
+          <w:p>
+            <w:r>
+              <w:rPr>
+                <w:sz w:val="19"/>
+              </w:rPr>
+              <w:t>7.0</w:t>
+            </w:r>
+          </w:p>
+        </w:tc>
+      </w:tr>
+      <w:tr>
+        <w:trPr>
+          <w:cantSplit/>
+        </w:trPr>
+        <w:tc>
+          <w:tcPr>
+            <w:tcW w:type="dxa" w:w="864"/>
+            <w:vAlign w:val="center"/>
+            <w:shd w:fill="F2F5F9"/>
+          </w:tcPr>
+          <w:p>
+            <w:r>
+              <w:rPr>
+                <w:sz w:val="19"/>
+              </w:rPr>
+              <w:t>8</w:t>
+            </w:r>
+          </w:p>
+        </w:tc>
+        <w:tc>
+          <w:tcPr>
+            <w:tcW w:type="dxa" w:w="1584"/>
+            <w:vAlign w:val="center"/>
+            <w:shd w:fill="F2F5F9"/>
+          </w:tcPr>
+          <w:p>
+            <w:r>
+              <w:rPr>
+                <w:sz w:val="19"/>
+              </w:rPr>
+              <w:t>DE180206</w:t>
+            </w:r>
+          </w:p>
+        </w:tc>
+        <w:tc>
+          <w:tcPr>
+            <w:tcW w:type="dxa" w:w="1440"/>
+            <w:vAlign w:val="center"/>
+            <w:shd w:fill="F2F5F9"/>
+          </w:tcPr>
+          <w:p>
+            <w:r>
+              <w:rPr>
+                <w:sz w:val="19"/>
+              </w:rPr>
+              <w:t>7.0</w:t>
+            </w:r>
+          </w:p>
+        </w:tc>
+        <w:tc>
+          <w:tcPr>
+            <w:tcW w:type="dxa" w:w="1440"/>
+            <w:vAlign w:val="center"/>
+            <w:shd w:fill="F2F5F9"/>
+          </w:tcPr>
+          <w:p>
+            <w:r>
+              <w:rPr>
+                <w:sz w:val="19"/>
+              </w:rPr>
+              <w:t>7.0</w:t>
+            </w:r>
+          </w:p>
+        </w:tc>
+        <w:tc>
+          <w:tcPr>
+            <w:tcW w:type="dxa" w:w="864"/>
+            <w:vAlign w:val="center"/>
+            <w:shd w:fill="F2F5F9"/>
+          </w:tcPr>
+          <w:p>
+            <w:r>
+              <w:rPr>
+                <w:sz w:val="19"/>
+              </w:rPr>
+              <w:t>24</w:t>
+            </w:r>
+          </w:p>
+        </w:tc>
+        <w:tc>
+          <w:tcPr>
+            <w:tcW w:type="dxa" w:w="1584"/>
+            <w:vAlign w:val="center"/>
+            <w:shd w:fill="F2F5F9"/>
+          </w:tcPr>
+          <w:p>
+            <w:r>
+              <w:rPr>
+                <w:sz w:val="19"/>
+              </w:rPr>
+              <w:t>6754</w:t>
+            </w:r>
+          </w:p>
+        </w:tc>
+        <w:tc>
+          <w:tcPr>
+            <w:tcW w:type="dxa" w:w="1440"/>
+            <w:vAlign w:val="center"/>
+            <w:shd w:fill="F2F5F9"/>
+          </w:tcPr>
+          <w:p>
+            <w:r>
+              <w:rPr>
+                <w:sz w:val="19"/>
+              </w:rPr>
+              <w:t>8.0</w:t>
+            </w:r>
+          </w:p>
+        </w:tc>
+        <w:tc>
+          <w:tcPr>
+            <w:tcW w:type="dxa" w:w="1440"/>
+            <w:vAlign w:val="center"/>
+            <w:shd w:fill="F2F5F9"/>
+          </w:tcPr>
+          <w:p>
+            <w:r>
+              <w:rPr>
+                <w:sz w:val="19"/>
+              </w:rPr>
+              <w:t>7.5</w:t>
+            </w:r>
+          </w:p>
+        </w:tc>
+      </w:tr>
+      <w:tr>
+        <w:trPr>
+          <w:cantSplit/>
+        </w:trPr>
+        <w:tc>
+          <w:tcPr>
+            <w:tcW w:type="dxa" w:w="864"/>
+            <w:vAlign w:val="center"/>
+          </w:tcPr>
+          <w:p>
+            <w:r>
+              <w:rPr>
+                <w:sz w:val="19"/>
+              </w:rPr>
+              <w:t>9</w:t>
+            </w:r>
+          </w:p>
+        </w:tc>
+        <w:tc>
+          <w:tcPr>
+            <w:tcW w:type="dxa" w:w="1584"/>
+            <w:vAlign w:val="center"/>
+          </w:tcPr>
+          <w:p>
+            <w:r>
+              <w:rPr>
+                <w:sz w:val="19"/>
+              </w:rPr>
+              <w:t>0223</w:t>
+            </w:r>
+          </w:p>
+        </w:tc>
+        <w:tc>
+          <w:tcPr>
+            <w:tcW w:type="dxa" w:w="1440"/>
+            <w:vAlign w:val="center"/>
+          </w:tcPr>
+          <w:p>
+            <w:r>
+              <w:rPr>
+                <w:sz w:val="19"/>
+              </w:rPr>
+              <w:t>7.5</w:t>
+            </w:r>
+          </w:p>
+        </w:tc>
+        <w:tc>
+          <w:tcPr>
+            <w:tcW w:type="dxa" w:w="1440"/>
+            <w:vAlign w:val="center"/>
+          </w:tcPr>
+          <w:p>
+            <w:r>
+              <w:rPr>
+                <w:sz w:val="19"/>
+              </w:rPr>
+              <w:t>8.5</w:t>
+            </w:r>
+          </w:p>
+        </w:tc>
+        <w:tc>
+          <w:tcPr>
+            <w:tcW w:type="dxa" w:w="864"/>
+            <w:vAlign w:val="center"/>
+          </w:tcPr>
+          <w:p>
+            <w:r>
+              <w:rPr>
+                <w:sz w:val="19"/>
+              </w:rPr>
+              <w:t>25</w:t>
+            </w:r>
+          </w:p>
+        </w:tc>
+        <w:tc>
+          <w:tcPr>
+            <w:tcW w:type="dxa" w:w="1584"/>
+            <w:vAlign w:val="center"/>
+          </w:tcPr>
+          <w:p>
+            <w:r>
+              <w:rPr>
+                <w:sz w:val="19"/>
+              </w:rPr>
+              <w:t>0105</w:t>
+            </w:r>
+          </w:p>
+        </w:tc>
+        <w:tc>
+          <w:tcPr>
+            <w:tcW w:type="dxa" w:w="1440"/>
+            <w:vAlign w:val="center"/>
+          </w:tcPr>
+          <w:p>
+            <w:r>
+              <w:rPr>
+                <w:sz w:val="19"/>
+              </w:rPr>
+              <w:t>7.0</w:t>
+            </w:r>
+          </w:p>
+        </w:tc>
+        <w:tc>
+          <w:tcPr>
+            <w:tcW w:type="dxa" w:w="1440"/>
+            <w:vAlign w:val="center"/>
+          </w:tcPr>
+          <w:p>
+            <w:r>
+              <w:rPr>
+                <w:sz w:val="19"/>
+              </w:rPr>
+              <w:t>8.0</w:t>
+            </w:r>
+          </w:p>
+        </w:tc>
+      </w:tr>
+      <w:tr>
+        <w:trPr>
+          <w:cantSplit/>
+        </w:trPr>
+        <w:tc>
+          <w:tcPr>
+            <w:tcW w:type="dxa" w:w="864"/>
+            <w:vAlign w:val="center"/>
+            <w:shd w:fill="F2F5F9"/>
+          </w:tcPr>
+          <w:p>
+            <w:r>
+              <w:rPr>
+                <w:sz w:val="19"/>
+              </w:rPr>
+              <w:t>10</w:t>
+            </w:r>
+          </w:p>
+        </w:tc>
+        <w:tc>
+          <w:tcPr>
+            <w:tcW w:type="dxa" w:w="1584"/>
+            <w:vAlign w:val="center"/>
+            <w:shd w:fill="F2F5F9"/>
+          </w:tcPr>
+          <w:p>
+            <w:r>
+              <w:rPr>
+                <w:sz w:val="19"/>
+              </w:rPr>
+              <w:t>0379</w:t>
+            </w:r>
+          </w:p>
+        </w:tc>
+        <w:tc>
+          <w:tcPr>
+            <w:tcW w:type="dxa" w:w="1440"/>
+            <w:vAlign w:val="center"/>
+            <w:shd w:fill="F2F5F9"/>
+          </w:tcPr>
+          <w:p>
+            <w:r>
+              <w:rPr>
+                <w:sz w:val="19"/>
+              </w:rPr>
+              <w:t>6.8</w:t>
+            </w:r>
+          </w:p>
+        </w:tc>
+        <w:tc>
+          <w:tcPr>
+            <w:tcW w:type="dxa" w:w="1440"/>
+            <w:vAlign w:val="center"/>
+            <w:shd w:fill="F2F5F9"/>
+          </w:tcPr>
+          <w:p>
+            <w:r>
+              <w:rPr>
+                <w:sz w:val="19"/>
+              </w:rPr>
+              <w:t>6.5</w:t>
+            </w:r>
+          </w:p>
+        </w:tc>
+        <w:tc>
+          <w:tcPr>
+            <w:tcW w:type="dxa" w:w="864"/>
+            <w:vAlign w:val="center"/>
+            <w:shd w:fill="F2F5F9"/>
+          </w:tcPr>
+          <w:p>
+            <w:r>
+              <w:rPr>
+                <w:sz w:val="19"/>
+              </w:rPr>
+              <w:t>26</w:t>
+            </w:r>
+          </w:p>
+        </w:tc>
+        <w:tc>
+          <w:tcPr>
+            <w:tcW w:type="dxa" w:w="1584"/>
+            <w:vAlign w:val="center"/>
+            <w:shd w:fill="F2F5F9"/>
+          </w:tcPr>
+          <w:p>
+            <w:r>
+              <w:rPr>
+                <w:sz w:val="19"/>
+              </w:rPr>
+              <w:t>110240044</w:t>
+            </w:r>
+          </w:p>
+        </w:tc>
+        <w:tc>
+          <w:tcPr>
+            <w:tcW w:type="dxa" w:w="1440"/>
+            <w:vAlign w:val="center"/>
+            <w:shd w:fill="F2F5F9"/>
+          </w:tcPr>
+          <w:p>
+            <w:r>
+              <w:rPr>
+                <w:sz w:val="19"/>
+              </w:rPr>
+              <w:t>5.0</w:t>
+            </w:r>
+          </w:p>
+        </w:tc>
+        <w:tc>
+          <w:tcPr>
+            <w:tcW w:type="dxa" w:w="1440"/>
+            <w:vAlign w:val="center"/>
+            <w:shd w:fill="F2F5F9"/>
+          </w:tcPr>
+          <w:p>
+            <w:r>
+              <w:rPr>
+                <w:sz w:val="19"/>
+              </w:rPr>
+              <w:t>5.0</w:t>
+            </w:r>
+          </w:p>
+        </w:tc>
+      </w:tr>
+      <w:tr>
+        <w:trPr>
+          <w:cantSplit/>
+        </w:trPr>
+        <w:tc>
+          <w:tcPr>
+            <w:tcW w:type="dxa" w:w="864"/>
+            <w:vAlign w:val="center"/>
+          </w:tcPr>
+          <w:p>
+            <w:r>
+              <w:rPr>
+                <w:sz w:val="19"/>
+              </w:rPr>
+              <w:t>11</w:t>
+            </w:r>
+          </w:p>
+        </w:tc>
+        <w:tc>
+          <w:tcPr>
+            <w:tcW w:type="dxa" w:w="1584"/>
+            <w:vAlign w:val="center"/>
+          </w:tcPr>
+          <w:p>
+            <w:r>
+              <w:rPr>
+                <w:sz w:val="19"/>
+              </w:rPr>
+              <w:t>Kkkkk</w:t>
+            </w:r>
+          </w:p>
+        </w:tc>
+        <w:tc>
+          <w:tcPr>
+            <w:tcW w:type="dxa" w:w="1440"/>
+            <w:vAlign w:val="center"/>
+          </w:tcPr>
+          <w:p>
+            <w:r>
+              <w:rPr>
+                <w:sz w:val="19"/>
+              </w:rPr>
+              <w:t>7.0</w:t>
+            </w:r>
+          </w:p>
+        </w:tc>
+        <w:tc>
+          <w:tcPr>
+            <w:tcW w:type="dxa" w:w="1440"/>
+            <w:vAlign w:val="center"/>
+          </w:tcPr>
+          <w:p>
+            <w:r>
+              <w:rPr>
+                <w:sz w:val="19"/>
+              </w:rPr>
+              <w:t>6.0</w:t>
+            </w:r>
+          </w:p>
+        </w:tc>
+        <w:tc>
+          <w:tcPr>
+            <w:tcW w:type="dxa" w:w="864"/>
+            <w:vAlign w:val="center"/>
+          </w:tcPr>
+          <w:p>
+            <w:r>
+              <w:rPr>
+                <w:sz w:val="19"/>
+              </w:rPr>
+              <w:t>27</w:t>
+            </w:r>
+          </w:p>
+        </w:tc>
+        <w:tc>
+          <w:tcPr>
+            <w:tcW w:type="dxa" w:w="1584"/>
+            <w:vAlign w:val="center"/>
+          </w:tcPr>
+          <w:p>
+            <w:r>
+              <w:rPr>
+                <w:sz w:val="19"/>
+              </w:rPr>
+              <w:t>0326</w:t>
+            </w:r>
+          </w:p>
+        </w:tc>
+        <w:tc>
+          <w:tcPr>
+            <w:tcW w:type="dxa" w:w="1440"/>
+            <w:vAlign w:val="center"/>
+          </w:tcPr>
+          <w:p>
+            <w:r>
+              <w:rPr>
+                <w:sz w:val="19"/>
+              </w:rPr>
+              <w:t>8.0</w:t>
+            </w:r>
+          </w:p>
+        </w:tc>
+        <w:tc>
+          <w:tcPr>
+            <w:tcW w:type="dxa" w:w="1440"/>
+            <w:vAlign w:val="center"/>
+          </w:tcPr>
+          <w:p>
+            <w:r>
+              <w:rPr>
+                <w:sz w:val="19"/>
+              </w:rPr>
+              <w:t>7.1</w:t>
+            </w:r>
+          </w:p>
+        </w:tc>
+      </w:tr>
+      <w:tr>
+        <w:trPr>
+          <w:cantSplit/>
+        </w:trPr>
+        <w:tc>
+          <w:tcPr>
+            <w:tcW w:type="dxa" w:w="864"/>
+            <w:vAlign w:val="center"/>
+            <w:shd w:fill="F2F5F9"/>
+          </w:tcPr>
+          <w:p>
+            <w:r>
+              <w:rPr>
+                <w:sz w:val="19"/>
+              </w:rPr>
+              <w:t>12</w:t>
+            </w:r>
+          </w:p>
+        </w:tc>
+        <w:tc>
+          <w:tcPr>
+            <w:tcW w:type="dxa" w:w="1584"/>
+            <w:vAlign w:val="center"/>
+            <w:shd w:fill="F2F5F9"/>
+          </w:tcPr>
+          <w:p>
+            <w:r>
+              <w:rPr>
+                <w:sz w:val="19"/>
+              </w:rPr>
+              <w:t>Thonaucutephomaique</w:t>
+            </w:r>
+          </w:p>
+        </w:tc>
+        <w:tc>
+          <w:tcPr>
+            <w:tcW w:type="dxa" w:w="1440"/>
+            <w:vAlign w:val="center"/>
+            <w:shd w:fill="F2F5F9"/>
+          </w:tcPr>
+          <w:p>
+            <w:r>
+              <w:rPr>
+                <w:sz w:val="19"/>
+              </w:rPr>
+              <w:t>9.5</w:t>
+            </w:r>
+          </w:p>
+        </w:tc>
+        <w:tc>
+          <w:tcPr>
+            <w:tcW w:type="dxa" w:w="1440"/>
+            <w:vAlign w:val="center"/>
+            <w:shd w:fill="F2F5F9"/>
+          </w:tcPr>
+          <w:p>
+            <w:r>
+              <w:rPr>
+                <w:sz w:val="19"/>
+              </w:rPr>
+              <w:t>9.0</w:t>
+            </w:r>
+          </w:p>
+        </w:tc>
+        <w:tc>
+          <w:tcPr>
+            <w:tcW w:type="dxa" w:w="864"/>
+            <w:vAlign w:val="center"/>
+            <w:shd w:fill="F2F5F9"/>
+          </w:tcPr>
+          <w:p>
+            <w:r>
+              <w:rPr>
+                <w:sz w:val="19"/>
+              </w:rPr>
+              <w:t>28</w:t>
+            </w:r>
+          </w:p>
+        </w:tc>
+        <w:tc>
+          <w:tcPr>
+            <w:tcW w:type="dxa" w:w="1584"/>
+            <w:vAlign w:val="center"/>
+            <w:shd w:fill="F2F5F9"/>
+          </w:tcPr>
+          <w:p>
+            <w:r>
+              <w:rPr>
+                <w:sz w:val="19"/>
+              </w:rPr>
+              <w:t>De200471</w:t>
+            </w:r>
+          </w:p>
+        </w:tc>
+        <w:tc>
+          <w:tcPr>
+            <w:tcW w:type="dxa" w:w="1440"/>
+            <w:vAlign w:val="center"/>
+            <w:shd w:fill="F2F5F9"/>
+          </w:tcPr>
+          <w:p>
+            <w:r>
+              <w:rPr>
+                <w:sz w:val="19"/>
+              </w:rPr>
+              <w:t>7.0</w:t>
+            </w:r>
+          </w:p>
+        </w:tc>
+        <w:tc>
+          <w:tcPr>
+            <w:tcW w:type="dxa" w:w="1440"/>
+            <w:vAlign w:val="center"/>
+            <w:shd w:fill="F2F5F9"/>
+          </w:tcPr>
+          <w:p>
+            <w:r>
+              <w:rPr>
+                <w:sz w:val="19"/>
+              </w:rPr>
+              <w:t>6.0</w:t>
+            </w:r>
+          </w:p>
+        </w:tc>
+      </w:tr>
+      <w:tr>
+        <w:trPr>
+          <w:cantSplit/>
+        </w:trPr>
+        <w:tc>
+          <w:tcPr>
+            <w:tcW w:type="dxa" w:w="864"/>
+            <w:vAlign w:val="center"/>
+          </w:tcPr>
+          <w:p>
+            <w:r>
+              <w:rPr>
+                <w:sz w:val="19"/>
+              </w:rPr>
+              <w:t>13</w:t>
+            </w:r>
+          </w:p>
+        </w:tc>
+        <w:tc>
+          <w:tcPr>
+            <w:tcW w:type="dxa" w:w="1584"/>
+            <w:vAlign w:val="center"/>
+          </w:tcPr>
+          <w:p>
+            <w:r>
+              <w:rPr>
+                <w:sz w:val="19"/>
+              </w:rPr>
+              <w:t>Ds200011</w:t>
+            </w:r>
+          </w:p>
+        </w:tc>
+        <w:tc>
+          <w:tcPr>
+            <w:tcW w:type="dxa" w:w="1440"/>
+            <w:vAlign w:val="center"/>
+          </w:tcPr>
+          <w:p>
+            <w:r>
+              <w:rPr>
+                <w:sz w:val="19"/>
+              </w:rPr>
+              <w:t>8.2</w:t>
+            </w:r>
+          </w:p>
+        </w:tc>
+        <w:tc>
+          <w:tcPr>
+            <w:tcW w:type="dxa" w:w="1440"/>
+            <w:vAlign w:val="center"/>
+          </w:tcPr>
+          <w:p>
+            <w:r>
+              <w:rPr>
+                <w:sz w:val="19"/>
+              </w:rPr>
+              <w:t>7.8</w:t>
+            </w:r>
+          </w:p>
+        </w:tc>
+        <w:tc>
+          <w:tcPr>
+            <w:tcW w:type="dxa" w:w="864"/>
+            <w:vAlign w:val="center"/>
+          </w:tcPr>
+          <w:p>
+            <w:r>
+              <w:rPr>
+                <w:sz w:val="19"/>
+              </w:rPr>
+              <w:t>29</w:t>
+            </w:r>
+          </w:p>
+        </w:tc>
+        <w:tc>
+          <w:tcPr>
+            <w:tcW w:type="dxa" w:w="1584"/>
+            <w:vAlign w:val="center"/>
+          </w:tcPr>
+          <w:p>
+            <w:r>
+              <w:rPr>
+                <w:sz w:val="19"/>
+              </w:rPr>
+              <w:t>4781/phuong</w:t>
+            </w:r>
+          </w:p>
+        </w:tc>
+        <w:tc>
+          <w:tcPr>
+            <w:tcW w:type="dxa" w:w="1440"/>
+            <w:vAlign w:val="center"/>
+          </w:tcPr>
+          <w:p>
+            <w:r>
+              <w:rPr>
+                <w:sz w:val="19"/>
+              </w:rPr>
+              <w:t>9.0</w:t>
+            </w:r>
+          </w:p>
+        </w:tc>
+        <w:tc>
+          <w:tcPr>
+            <w:tcW w:type="dxa" w:w="1440"/>
+            <w:vAlign w:val="center"/>
+          </w:tcPr>
+          <w:p>
+            <w:r>
+              <w:rPr>
+                <w:sz w:val="19"/>
+              </w:rPr>
+              <w:t>5.0</w:t>
+            </w:r>
+          </w:p>
+        </w:tc>
+      </w:tr>
+      <w:tr>
+        <w:trPr>
+          <w:cantSplit/>
+        </w:trPr>
+        <w:tc>
+          <w:tcPr>
+            <w:tcW w:type="dxa" w:w="864"/>
+            <w:vAlign w:val="center"/>
+            <w:shd w:fill="F2F5F9"/>
+          </w:tcPr>
+          <w:p>
+            <w:r>
+              <w:rPr>
+                <w:sz w:val="19"/>
+              </w:rPr>
+              <w:t>14</w:t>
+            </w:r>
+          </w:p>
+        </w:tc>
+        <w:tc>
+          <w:tcPr>
+            <w:tcW w:type="dxa" w:w="1584"/>
+            <w:vAlign w:val="center"/>
+            <w:shd w:fill="F2F5F9"/>
+          </w:tcPr>
+          <w:p>
+            <w:r>
+              <w:rPr>
+                <w:sz w:val="19"/>
+              </w:rPr>
+              <w:t>hehe</w:t>
+            </w:r>
+          </w:p>
+        </w:tc>
+        <w:tc>
+          <w:tcPr>
+            <w:tcW w:type="dxa" w:w="1440"/>
+            <w:vAlign w:val="center"/>
+            <w:shd w:fill="F2F5F9"/>
+          </w:tcPr>
+          <w:p>
+            <w:r>
+              <w:rPr>
+                <w:sz w:val="19"/>
+              </w:rPr>
+              <w:t>6.0</w:t>
+            </w:r>
+          </w:p>
+        </w:tc>
+        <w:tc>
+          <w:tcPr>
+            <w:tcW w:type="dxa" w:w="1440"/>
+            <w:vAlign w:val="center"/>
+            <w:shd w:fill="F2F5F9"/>
+          </w:tcPr>
+          <w:p>
+            <w:r>
+              <w:rPr>
+                <w:sz w:val="19"/>
+              </w:rPr>
+              <w:t>8.0</w:t>
+            </w:r>
+          </w:p>
+        </w:tc>
+        <w:tc>
+          <w:tcPr>
+            <w:tcW w:type="dxa" w:w="864"/>
+            <w:vAlign w:val="center"/>
+            <w:shd w:fill="F2F5F9"/>
+          </w:tcPr>
+          <w:p>
+            <w:r>
+              <w:rPr>
+                <w:sz w:val="19"/>
+              </w:rPr>
+              <w:t>30</w:t>
+            </w:r>
+          </w:p>
+        </w:tc>
+        <w:tc>
+          <w:tcPr>
+            <w:tcW w:type="dxa" w:w="1584"/>
+            <w:vAlign w:val="center"/>
+            <w:shd w:fill="F2F5F9"/>
+          </w:tcPr>
+          <w:p>
+            <w:r>
+              <w:rPr>
+                <w:sz w:val="19"/>
+              </w:rPr>
+              <w:t>DE200346</w:t>
+            </w:r>
+          </w:p>
+        </w:tc>
+        <w:tc>
+          <w:tcPr>
+            <w:tcW w:type="dxa" w:w="1440"/>
+            <w:vAlign w:val="center"/>
+            <w:shd w:fill="F2F5F9"/>
+          </w:tcPr>
+          <w:p>
+            <w:r>
+              <w:rPr>
+                <w:sz w:val="19"/>
+              </w:rPr>
+              <w:t>9.0</w:t>
+            </w:r>
+          </w:p>
+        </w:tc>
+        <w:tc>
+          <w:tcPr>
+            <w:tcW w:type="dxa" w:w="1440"/>
+            <w:vAlign w:val="center"/>
+            <w:shd w:fill="F2F5F9"/>
+          </w:tcPr>
+          <w:p>
+            <w:r>
+              <w:rPr>
+                <w:sz w:val="19"/>
+              </w:rPr>
+              <w:t>10.0</w:t>
+            </w:r>
+          </w:p>
+        </w:tc>
+      </w:tr>
+      <w:tr>
+        <w:trPr>
+          <w:cantSplit/>
+        </w:trPr>
+        <w:tc>
+          <w:tcPr>
+            <w:tcW w:type="dxa" w:w="864"/>
+            <w:vAlign w:val="center"/>
+          </w:tcPr>
+          <w:p>
+            <w:r>
+              <w:rPr>
+                <w:sz w:val="19"/>
+              </w:rPr>
+              <w:t>15</w:t>
+            </w:r>
+          </w:p>
+        </w:tc>
+        <w:tc>
+          <w:tcPr>
+            <w:tcW w:type="dxa" w:w="1584"/>
+            <w:vAlign w:val="center"/>
+          </w:tcPr>
+          <w:p>
+            <w:r>
+              <w:rPr>
+                <w:sz w:val="19"/>
+              </w:rPr>
+              <w:t>cute</w:t>
+            </w:r>
+          </w:p>
+        </w:tc>
+        <w:tc>
+          <w:tcPr>
+            <w:tcW w:type="dxa" w:w="1440"/>
+            <w:vAlign w:val="center"/>
+          </w:tcPr>
+          <w:p>
+            <w:r>
+              <w:rPr>
+                <w:sz w:val="19"/>
+              </w:rPr>
+              <w:t>7.0</w:t>
+            </w:r>
+          </w:p>
+        </w:tc>
+        <w:tc>
+          <w:tcPr>
+            <w:tcW w:type="dxa" w:w="1440"/>
+            <w:vAlign w:val="center"/>
+          </w:tcPr>
+          <w:p>
+            <w:r>
+              <w:rPr>
+                <w:sz w:val="19"/>
+              </w:rPr>
+              <w:t>6.0</w:t>
+            </w:r>
+          </w:p>
+        </w:tc>
+        <w:tc>
+          <w:tcPr>
+            <w:tcW w:type="dxa" w:w="864"/>
+            <w:vAlign w:val="center"/>
+          </w:tcPr>
+          <w:p>
+            <w:r>
+              <w:rPr>
+                <w:sz w:val="19"/>
+              </w:rPr>
+              <w:t>31</w:t>
+            </w:r>
+          </w:p>
+        </w:tc>
+        <w:tc>
+          <w:tcPr>
+            <w:tcW w:type="dxa" w:w="1584"/>
+            <w:vAlign w:val="center"/>
+          </w:tcPr>
+          <w:p>
+            <w:r>
+              <w:rPr>
+                <w:sz w:val="19"/>
+              </w:rPr>
+              <w:t>0217</w:t>
+            </w:r>
+          </w:p>
+        </w:tc>
+        <w:tc>
+          <w:tcPr>
+            <w:tcW w:type="dxa" w:w="1440"/>
+            <w:vAlign w:val="center"/>
+          </w:tcPr>
+          <w:p>
+            <w:r>
+              <w:rPr>
+                <w:sz w:val="19"/>
+              </w:rPr>
+              <w:t>5.0</w:t>
+            </w:r>
+          </w:p>
+        </w:tc>
+        <w:tc>
+          <w:tcPr>
+            <w:tcW w:type="dxa" w:w="1440"/>
+            <w:vAlign w:val="center"/>
+          </w:tcPr>
+          <w:p>
+            <w:r>
+              <w:rPr>
+                <w:sz w:val="19"/>
+              </w:rPr>
+              <w:t>6.4</w:t>
+            </w:r>
+          </w:p>
+        </w:tc>
+      </w:tr>
+      <w:tr>
+        <w:trPr>
+          <w:cantSplit/>
+        </w:trPr>
+        <w:tc>
+          <w:tcPr>
+            <w:tcW w:type="dxa" w:w="864"/>
+            <w:vAlign w:val="center"/>
+            <w:shd w:fill="F2F5F9"/>
+          </w:tcPr>
+          <w:p>
+            <w:r>
+              <w:rPr>
+                <w:sz w:val="19"/>
+              </w:rPr>
+              <w:t>16</w:t>
+            </w:r>
+          </w:p>
+        </w:tc>
+        <w:tc>
+          <w:tcPr>
+            <w:tcW w:type="dxa" w:w="1584"/>
+            <w:vAlign w:val="center"/>
+            <w:shd w:fill="F2F5F9"/>
+          </w:tcPr>
+          <w:p>
+            <w:r>
+              <w:rPr>
+                <w:sz w:val="19"/>
+              </w:rPr>
+              <w:t>DE200132</w:t>
+            </w:r>
+          </w:p>
+        </w:tc>
+        <w:tc>
+          <w:tcPr>
+            <w:tcW w:type="dxa" w:w="1440"/>
+            <w:vAlign w:val="center"/>
+            <w:shd w:fill="F2F5F9"/>
+          </w:tcPr>
+          <w:p>
+            <w:r>
+              <w:rPr>
+                <w:sz w:val="19"/>
+              </w:rPr>
+              <w:t>8.0</w:t>
+            </w:r>
+          </w:p>
+        </w:tc>
+        <w:tc>
+          <w:tcPr>
+            <w:tcW w:type="dxa" w:w="1440"/>
+            <w:vAlign w:val="center"/>
+            <w:shd w:fill="F2F5F9"/>
+          </w:tcPr>
+          <w:p>
+            <w:r>
+              <w:rPr>
+                <w:sz w:val="19"/>
+              </w:rPr>
+              <w:t>8.0</w:t>
+            </w:r>
+          </w:p>
+        </w:tc>
+        <w:tc>
+          <w:tcPr>
+            <w:tcW w:type="dxa" w:w="864"/>
+            <w:vAlign w:val="center"/>
+            <w:shd w:fill="F2F5F9"/>
+          </w:tcPr>
+          <w:p>
+            <w:r>
+              <w:rPr>
+                <w:sz w:val="19"/>
+              </w:rPr>
+              <w:t>32</w:t>
+            </w:r>
+          </w:p>
+        </w:tc>
+        <w:tc>
+          <w:tcPr>
+            <w:tcW w:type="dxa" w:w="1584"/>
+            <w:vAlign w:val="center"/>
+            <w:shd w:fill="F2F5F9"/>
+          </w:tcPr>
+          <w:p>
+            <w:r>
+              <w:rPr>
+                <w:sz w:val="19"/>
+              </w:rPr>
+              <w:t>Kakak</w:t>
+            </w:r>
+          </w:p>
+        </w:tc>
+        <w:tc>
+          <w:tcPr>
+            <w:tcW w:type="dxa" w:w="1440"/>
+            <w:vAlign w:val="center"/>
+            <w:shd w:fill="F2F5F9"/>
+          </w:tcPr>
+          <w:p>
+            <w:r>
+              <w:rPr>
+                <w:sz w:val="19"/>
+              </w:rPr>
+              <w:t>7.0</w:t>
+            </w:r>
+          </w:p>
+        </w:tc>
+        <w:tc>
+          <w:tcPr>
+            <w:tcW w:type="dxa" w:w="1440"/>
+            <w:vAlign w:val="center"/>
+            <w:shd w:fill="F2F5F9"/>
+          </w:tcPr>
+          <w:p>
+            <w:r>
+              <w:rPr>
+                <w:sz w:val="19"/>
+              </w:rPr>
+              <w:t>6.0</w:t>
+            </w:r>
+          </w:p>
+        </w:tc>
+      </w:tr>
+    </w:tbl>
+    <w:p>
+      <w:pPr>
+        <w:pStyle w:val="Heading2"/>
+      </w:pPr>
+      <w:r>
+        <w:br/>
+        <w:t>Phụ lục D. Bảng công thức tính toán Excel và Mã nguồn Python có thể tái lập (Reproducible)</w:t>
+      </w:r>
+    </w:p>
+    <w:p>
+      <w:r>
+        <w:t>Toàn bộ các phép tính toán thống kê trong đề tài đều có thể tái lập 100% bằng cả hai công cụ: Bảng tính Microsoft Excel (sử dụng công thức nguyên bản) và Ngôn ngữ lập trình Python (sử dụng thư viện scipy/statsmodels):</w:t>
+        <w:br/>
+        <w:br/>
+        <w:t>1. Bảng đối chiếu công thức Excel và hàm Python tương ứng:</w:t>
+      </w:r>
+    </w:p>
+    <w:tbl>
+      <w:tblPr>
+        <w:tblW w:type="auto" w:w="0"/>
+        <w:jc w:val="center"/>
+        <w:tblLook w:firstColumn="1" w:firstRow="1" w:lastColumn="0" w:lastRow="0" w:noHBand="0" w:noVBand="1" w:val="04A0"/>
+      </w:tblPr>
+      <w:tblGrid>
+        <w:gridCol w:w="2340"/>
+        <w:gridCol w:w="2340"/>
+        <w:gridCol w:w="2340"/>
+        <w:gridCol w:w="2340"/>
+      </w:tblGrid>
+      <w:tr>
+        <w:trPr>
+          <w:cantSplit/>
+          <w:tblHeader/>
+        </w:trPr>
+        <w:tc>
+          <w:tcPr>
+            <w:tcW w:type="dxa" w:w="2592"/>
+            <w:vAlign w:val="center"/>
+            <w:shd w:fill="1F497D"/>
+          </w:tcPr>
+          <w:p>
+            <w:pPr>
+              <w:jc w:val="center"/>
+            </w:pPr>
+            <w:r>
+              <w:rPr>
+                <w:b/>
+                <w:color w:val="FFFFFF"/>
+                <w:sz w:val="20"/>
+              </w:rPr>
+              <w:t>Nội dung thống kê</w:t>
+            </w:r>
+          </w:p>
+        </w:tc>
+        <w:tc>
+          <w:tcPr>
+            <w:tcW w:type="dxa" w:w="1584"/>
+            <w:vAlign w:val="center"/>
+            <w:shd w:fill="1F497D"/>
+          </w:tcPr>
+          <w:p>
+            <w:pPr>
+              <w:jc w:val="center"/>
+            </w:pPr>
+            <w:r>
+              <w:rPr>
+                <w:b/>
+                <w:color w:val="FFFFFF"/>
+                <w:sz w:val="20"/>
+              </w:rPr>
+              <w:t>Ký hiệu</w:t>
+            </w:r>
+          </w:p>
+        </w:tc>
+        <w:tc>
+          <w:tcPr>
+            <w:tcW w:type="dxa" w:w="3024"/>
+            <w:vAlign w:val="center"/>
+            <w:shd w:fill="1F497D"/>
+          </w:tcPr>
+          <w:p>
+            <w:pPr>
+              <w:jc w:val="center"/>
+            </w:pPr>
+            <w:r>
+              <w:rPr>
+                <w:b/>
+                <w:color w:val="FFFFFF"/>
+                <w:sz w:val="20"/>
+              </w:rPr>
+              <w:t>Công thức hàm Microsoft Excel</w:t>
+            </w:r>
+          </w:p>
+        </w:tc>
+        <w:tc>
+          <w:tcPr>
+            <w:tcW w:type="dxa" w:w="3168"/>
+            <w:vAlign w:val="center"/>
+            <w:shd w:fill="1F497D"/>
+          </w:tcPr>
+          <w:p>
+            <w:pPr>
+              <w:jc w:val="center"/>
+            </w:pPr>
+            <w:r>
+              <w:rPr>
+                <w:b/>
+                <w:color w:val="FFFFFF"/>
+                <w:sz w:val="20"/>
+              </w:rPr>
+              <w:t>Mã nguồn Python (scipy/statsmodels)</w:t>
+            </w:r>
+          </w:p>
+        </w:tc>
+      </w:tr>
+      <w:tr>
+        <w:trPr>
+          <w:cantSplit/>
+        </w:trPr>
+        <w:tc>
+          <w:tcPr>
+            <w:tcW w:type="dxa" w:w="2592"/>
+            <w:vAlign w:val="center"/>
+          </w:tcPr>
+          <w:p>
+            <w:r>
+              <w:rPr>
+                <w:sz w:val="19"/>
+              </w:rPr>
+              <w:t>Trung bình mẫu</w:t>
+            </w:r>
+          </w:p>
+        </w:tc>
+        <w:tc>
+          <w:tcPr>
+            <w:tcW w:type="dxa" w:w="1584"/>
+            <w:vAlign w:val="center"/>
+          </w:tcPr>
+          <w:p>
+            <w:r>
+              <w:rPr>
+                <w:sz w:val="19"/>
+              </w:rPr>
+              <w:t>X_bar, Y_bar</w:t>
+            </w:r>
+          </w:p>
+        </w:tc>
+        <w:tc>
+          <w:tcPr>
+            <w:tcW w:type="dxa" w:w="3024"/>
+            <w:vAlign w:val="center"/>
+          </w:tcPr>
+          <w:p>
+            <w:r>
+              <w:rPr>
+                <w:sz w:val="19"/>
+              </w:rPr>
+              <w:t>=AVERAGE(range)</w:t>
+            </w:r>
+          </w:p>
+        </w:tc>
+        <w:tc>
+          <w:tcPr>
+            <w:tcW w:type="dxa" w:w="3168"/>
+            <w:vAlign w:val="center"/>
+          </w:tcPr>
+          <w:p>
+            <w:r>
+              <w:rPr>
+                <w:sz w:val="19"/>
+              </w:rPr>
+              <w:t>np.mean(x), np.mean(y)</w:t>
+            </w:r>
+          </w:p>
+        </w:tc>
+      </w:tr>
+      <w:tr>
+        <w:trPr>
+          <w:cantSplit/>
+        </w:trPr>
+        <w:tc>
+          <w:tcPr>
+            <w:tcW w:type="dxa" w:w="2592"/>
+            <w:vAlign w:val="center"/>
+            <w:shd w:fill="F2F5F9"/>
+          </w:tcPr>
+          <w:p>
+            <w:r>
+              <w:rPr>
+                <w:sz w:val="19"/>
+              </w:rPr>
+              <w:t>Độ lệch chuẩn mẫu</w:t>
+            </w:r>
+          </w:p>
+        </w:tc>
+        <w:tc>
+          <w:tcPr>
+            <w:tcW w:type="dxa" w:w="1584"/>
+            <w:vAlign w:val="center"/>
+            <w:shd w:fill="F2F5F9"/>
+          </w:tcPr>
+          <w:p>
+            <w:r>
+              <w:rPr>
+                <w:sz w:val="19"/>
+              </w:rPr>
+              <w:t>s_X, s_Y</w:t>
+            </w:r>
+          </w:p>
+        </w:tc>
+        <w:tc>
+          <w:tcPr>
+            <w:tcW w:type="dxa" w:w="3024"/>
+            <w:vAlign w:val="center"/>
+            <w:shd w:fill="F2F5F9"/>
+          </w:tcPr>
+          <w:p>
+            <w:r>
+              <w:rPr>
+                <w:sz w:val="19"/>
+              </w:rPr>
+              <w:t>=STDEV.S(range)</w:t>
+            </w:r>
+          </w:p>
+        </w:tc>
+        <w:tc>
+          <w:tcPr>
+            <w:tcW w:type="dxa" w:w="3168"/>
+            <w:vAlign w:val="center"/>
+            <w:shd w:fill="F2F5F9"/>
+          </w:tcPr>
+          <w:p>
+            <w:r>
+              <w:rPr>
+                <w:sz w:val="19"/>
+              </w:rPr>
+              <w:t>np.std(x, ddof=1), np.std(y, ddof=1)</w:t>
+            </w:r>
+          </w:p>
+        </w:tc>
+      </w:tr>
+      <w:tr>
+        <w:trPr>
+          <w:cantSplit/>
+        </w:trPr>
+        <w:tc>
+          <w:tcPr>
+            <w:tcW w:type="dxa" w:w="2592"/>
+            <w:vAlign w:val="center"/>
+          </w:tcPr>
+          <w:p>
+            <w:r>
+              <w:rPr>
+                <w:sz w:val="19"/>
+              </w:rPr>
+              <w:t>Trung vị &amp; Tứ phân vị</w:t>
+            </w:r>
+          </w:p>
+        </w:tc>
+        <w:tc>
+          <w:tcPr>
+            <w:tcW w:type="dxa" w:w="1584"/>
+            <w:vAlign w:val="center"/>
+          </w:tcPr>
+          <w:p>
+            <w:r>
+              <w:rPr>
+                <w:sz w:val="19"/>
+              </w:rPr>
+              <w:t>Median, Q1, Q3</w:t>
+            </w:r>
+          </w:p>
+        </w:tc>
+        <w:tc>
+          <w:tcPr>
+            <w:tcW w:type="dxa" w:w="3024"/>
+            <w:vAlign w:val="center"/>
+          </w:tcPr>
+          <w:p>
+            <w:r>
+              <w:rPr>
+                <w:sz w:val="19"/>
+              </w:rPr>
+              <w:t>=MEDIAN(), =QUARTILE.INC(..., 1/3)</w:t>
+            </w:r>
+          </w:p>
+        </w:tc>
+        <w:tc>
+          <w:tcPr>
+            <w:tcW w:type="dxa" w:w="3168"/>
+            <w:vAlign w:val="center"/>
+          </w:tcPr>
+          <w:p>
+            <w:r>
+              <w:rPr>
+                <w:sz w:val="19"/>
+              </w:rPr>
+              <w:t>np.median(), np.percentile(..., [25, 75])</w:t>
+            </w:r>
+          </w:p>
+        </w:tc>
+      </w:tr>
+      <w:tr>
+        <w:trPr>
+          <w:cantSplit/>
+        </w:trPr>
+        <w:tc>
+          <w:tcPr>
+            <w:tcW w:type="dxa" w:w="2592"/>
+            <w:vAlign w:val="center"/>
+            <w:shd w:fill="F2F5F9"/>
+          </w:tcPr>
+          <w:p>
+            <w:r>
+              <w:rPr>
+                <w:sz w:val="19"/>
+              </w:rPr>
+              <w:t>Hệ số tương quan Pearson</w:t>
+            </w:r>
+          </w:p>
+        </w:tc>
+        <w:tc>
+          <w:tcPr>
+            <w:tcW w:type="dxa" w:w="1584"/>
+            <w:vAlign w:val="center"/>
+            <w:shd w:fill="F2F5F9"/>
+          </w:tcPr>
+          <w:p>
+            <w:r>
+              <w:rPr>
+                <w:sz w:val="19"/>
+              </w:rPr>
+              <w:t>r</w:t>
+            </w:r>
+          </w:p>
+        </w:tc>
+        <w:tc>
+          <w:tcPr>
+            <w:tcW w:type="dxa" w:w="3024"/>
+            <w:vAlign w:val="center"/>
+            <w:shd w:fill="F2F5F9"/>
+          </w:tcPr>
+          <w:p>
+            <w:r>
+              <w:rPr>
+                <w:sz w:val="19"/>
+              </w:rPr>
+              <w:t>=CORREL(X_range, Y_range)</w:t>
+            </w:r>
+          </w:p>
+        </w:tc>
+        <w:tc>
+          <w:tcPr>
+            <w:tcW w:type="dxa" w:w="3168"/>
+            <w:vAlign w:val="center"/>
+            <w:shd w:fill="F2F5F9"/>
+          </w:tcPr>
+          <w:p>
+            <w:r>
+              <w:rPr>
+                <w:sz w:val="19"/>
+              </w:rPr>
+              <w:t>scipy.stats.pearsonr(x, y)[0]</w:t>
+            </w:r>
+          </w:p>
+        </w:tc>
+      </w:tr>
+      <w:tr>
+        <w:trPr>
+          <w:cantSplit/>
+        </w:trPr>
+        <w:tc>
+          <w:tcPr>
+            <w:tcW w:type="dxa" w:w="2592"/>
+            <w:vAlign w:val="center"/>
+          </w:tcPr>
+          <w:p>
+            <w:r>
+              <w:rPr>
+                <w:sz w:val="19"/>
+              </w:rPr>
+              <w:t>Hệ số góc hồi quy</w:t>
+            </w:r>
+          </w:p>
+        </w:tc>
+        <w:tc>
+          <w:tcPr>
+            <w:tcW w:type="dxa" w:w="1584"/>
+            <w:vAlign w:val="center"/>
+          </w:tcPr>
+          <w:p>
+            <w:r>
+              <w:rPr>
+                <w:sz w:val="19"/>
+              </w:rPr>
+              <w:t>b1</w:t>
+            </w:r>
+          </w:p>
+        </w:tc>
+        <w:tc>
+          <w:tcPr>
+            <w:tcW w:type="dxa" w:w="3024"/>
+            <w:vAlign w:val="center"/>
+          </w:tcPr>
+          <w:p>
+            <w:r>
+              <w:rPr>
+                <w:sz w:val="19"/>
+              </w:rPr>
+              <w:t>=SLOPE(Y_range, X_range)</w:t>
+            </w:r>
+          </w:p>
+        </w:tc>
+        <w:tc>
+          <w:tcPr>
+            <w:tcW w:type="dxa" w:w="3168"/>
+            <w:vAlign w:val="center"/>
+          </w:tcPr>
+          <w:p>
+            <w:r>
+              <w:rPr>
+                <w:sz w:val="19"/>
+              </w:rPr>
+              <w:t>ols_res.params['midterm_score']</w:t>
+            </w:r>
+          </w:p>
+        </w:tc>
+      </w:tr>
+      <w:tr>
+        <w:trPr>
+          <w:cantSplit/>
+        </w:trPr>
+        <w:tc>
+          <w:tcPr>
+            <w:tcW w:type="dxa" w:w="2592"/>
+            <w:vAlign w:val="center"/>
+            <w:shd w:fill="F2F5F9"/>
+          </w:tcPr>
+          <w:p>
+            <w:r>
+              <w:rPr>
+                <w:sz w:val="19"/>
+              </w:rPr>
+              <w:t>Hệ số chặn hồi quy</w:t>
+            </w:r>
+          </w:p>
+        </w:tc>
+        <w:tc>
+          <w:tcPr>
+            <w:tcW w:type="dxa" w:w="1584"/>
+            <w:vAlign w:val="center"/>
+            <w:shd w:fill="F2F5F9"/>
+          </w:tcPr>
+          <w:p>
+            <w:r>
+              <w:rPr>
+                <w:sz w:val="19"/>
+              </w:rPr>
+              <w:t>b0</w:t>
+            </w:r>
+          </w:p>
+        </w:tc>
+        <w:tc>
+          <w:tcPr>
+            <w:tcW w:type="dxa" w:w="3024"/>
+            <w:vAlign w:val="center"/>
+            <w:shd w:fill="F2F5F9"/>
+          </w:tcPr>
+          <w:p>
+            <w:r>
+              <w:rPr>
+                <w:sz w:val="19"/>
+              </w:rPr>
+              <w:t>=INTERCEPT(Y_range, X_range)</w:t>
+            </w:r>
+          </w:p>
+        </w:tc>
+        <w:tc>
+          <w:tcPr>
+            <w:tcW w:type="dxa" w:w="3168"/>
+            <w:vAlign w:val="center"/>
+            <w:shd w:fill="F2F5F9"/>
+          </w:tcPr>
+          <w:p>
+            <w:r>
+              <w:rPr>
+                <w:sz w:val="19"/>
+              </w:rPr>
+              <w:t>ols_res.params['const']</w:t>
+            </w:r>
+          </w:p>
+        </w:tc>
+      </w:tr>
+      <w:tr>
+        <w:trPr>
+          <w:cantSplit/>
+        </w:trPr>
+        <w:tc>
+          <w:tcPr>
+            <w:tcW w:type="dxa" w:w="2592"/>
+            <w:vAlign w:val="center"/>
+          </w:tcPr>
+          <w:p>
+            <w:r>
+              <w:rPr>
+                <w:sz w:val="19"/>
+              </w:rPr>
+              <w:t>Hệ số xác định</w:t>
+            </w:r>
+          </w:p>
+        </w:tc>
+        <w:tc>
+          <w:tcPr>
+            <w:tcW w:type="dxa" w:w="1584"/>
+            <w:vAlign w:val="center"/>
+          </w:tcPr>
+          <w:p>
+            <w:r>
+              <w:rPr>
+                <w:sz w:val="19"/>
+              </w:rPr>
+              <w:t>R²</w:t>
+            </w:r>
+          </w:p>
+        </w:tc>
+        <w:tc>
+          <w:tcPr>
+            <w:tcW w:type="dxa" w:w="3024"/>
+            <w:vAlign w:val="center"/>
+          </w:tcPr>
+          <w:p>
+            <w:r>
+              <w:rPr>
+                <w:sz w:val="19"/>
+              </w:rPr>
+              <w:t>=RSQ(Y_range, X_range)</w:t>
+            </w:r>
+          </w:p>
+        </w:tc>
+        <w:tc>
+          <w:tcPr>
+            <w:tcW w:type="dxa" w:w="3168"/>
+            <w:vAlign w:val="center"/>
+          </w:tcPr>
+          <w:p>
+            <w:r>
+              <w:rPr>
+                <w:sz w:val="19"/>
+              </w:rPr>
+              <w:t>ols_res.rsquared</w:t>
+            </w:r>
+          </w:p>
+        </w:tc>
+      </w:tr>
+      <w:tr>
+        <w:trPr>
+          <w:cantSplit/>
+        </w:trPr>
+        <w:tc>
+          <w:tcPr>
+            <w:tcW w:type="dxa" w:w="2592"/>
+            <w:vAlign w:val="center"/>
+            <w:shd w:fill="F2F5F9"/>
+          </w:tcPr>
+          <w:p>
+            <w:r>
+              <w:rPr>
+                <w:sz w:val="19"/>
+              </w:rPr>
+              <w:t>Kiểm định giả thuyết t</w:t>
+            </w:r>
+          </w:p>
+        </w:tc>
+        <w:tc>
+          <w:tcPr>
+            <w:tcW w:type="dxa" w:w="1584"/>
+            <w:vAlign w:val="center"/>
+            <w:shd w:fill="F2F5F9"/>
+          </w:tcPr>
+          <w:p>
+            <w:r>
+              <w:rPr>
+                <w:sz w:val="19"/>
+              </w:rPr>
+              <w:t>t, p-value</w:t>
+            </w:r>
+          </w:p>
+        </w:tc>
+        <w:tc>
+          <w:tcPr>
+            <w:tcW w:type="dxa" w:w="3024"/>
+            <w:vAlign w:val="center"/>
+            <w:shd w:fill="F2F5F9"/>
+          </w:tcPr>
+          <w:p>
+            <w:r>
+              <w:rPr>
+                <w:sz w:val="19"/>
+              </w:rPr>
+              <w:t>=T.DIST.2T(ABS(t), df)</w:t>
+            </w:r>
+          </w:p>
+        </w:tc>
+        <w:tc>
+          <w:tcPr>
+            <w:tcW w:type="dxa" w:w="3168"/>
+            <w:vAlign w:val="center"/>
+            <w:shd w:fill="F2F5F9"/>
+          </w:tcPr>
+          <w:p>
+            <w:r>
+              <w:rPr>
+                <w:sz w:val="19"/>
+              </w:rPr>
+              <w:t>ols_res.pvalues['midterm_score']</w:t>
+            </w:r>
+          </w:p>
+        </w:tc>
+      </w:tr>
+    </w:tbl>
+    <w:p>
+      <w:r>
+        <w:br/>
+        <w:t>2. Đường dẫn trực tiếp đến sản phẩm mã nguồn và ứng dụng tương tác:</w:t>
+        <w:br/>
+        <w:t>• Ứng dụng Web tương tác Streamlit Cloud: https://masproject.streamlit.app</w:t>
+        <w:br/>
+        <w:t>• Kho lưu trữ toàn bộ mã nguồn trên GitHub: https://github.com/hieune321/mas-project-topic1</w:t>
+        <w:br/>
+        <w:t>• File Excel có công thức động: outputs/tables/MAS291_DeTai1_BangTinh_Va_DuLieu_TongHop.xlsx</w:t>
+        <w:br/>
+        <w:t>• Lệnh chạy tự động toàn bộ phân tích chỉ với 1 cú nhấp: run_pipeline.bat (hoặc python main.py)</w:t>
+        <w:br/>
+        <w:t>• Lệnh khởi động ứng dụng Web phân tích cục bộ: run_app.bat (hoặc streamlit run app.py)</w:t>
+      </w:r>
+    </w:p>
     <w:sectPr>
       <w:pgSz w:w="12240" w:h="15840"/>
       <w:pgMar w:top="1440" w:right="1440" w:bottom="1440" w:left="1440" w:header="720" w:footer="720" w:gutter="0"/>

</xml_diff>

<commit_message>
docs: add Streamlit cloud and GitHub links to report metadata table
</commit_message>
<xml_diff>
--- a/outputs/reports/Computer_Project_Topic_1_Report.docx
+++ b/outputs/reports/Computer_Project_Topic_1_Report.docx
@@ -224,6 +224,64 @@
               <w:t>Nguyễn Hữu Hoàng Thắng — DE200281 (Thành viên)</w:t>
               <w:br/>
               <w:t>Trần Đức Duy — DE180206 (Thành viên)</w:t>
+            </w:r>
+          </w:p>
+        </w:tc>
+      </w:tr>
+      <w:tr>
+        <w:tc>
+          <w:tcPr>
+            <w:tcW w:type="dxa" w:w="4680"/>
+          </w:tcPr>
+          <w:p>
+            <w:r>
+              <w:rPr>
+                <w:b/>
+                <w:sz w:val="22"/>
+              </w:rPr>
+              <w:t>Ứng dụng trực tuyến:</w:t>
+            </w:r>
+          </w:p>
+        </w:tc>
+        <w:tc>
+          <w:tcPr>
+            <w:tcW w:type="dxa" w:w="4680"/>
+          </w:tcPr>
+          <w:p>
+            <w:r>
+              <w:rPr>
+                <w:sz w:val="22"/>
+              </w:rPr>
+              <w:t>https://masproject.streamlit.app</w:t>
+            </w:r>
+          </w:p>
+        </w:tc>
+      </w:tr>
+      <w:tr>
+        <w:tc>
+          <w:tcPr>
+            <w:tcW w:type="dxa" w:w="4680"/>
+          </w:tcPr>
+          <w:p>
+            <w:r>
+              <w:rPr>
+                <w:b/>
+                <w:sz w:val="22"/>
+              </w:rPr>
+              <w:t>Kho mã nguồn GitHub:</w:t>
+            </w:r>
+          </w:p>
+        </w:tc>
+        <w:tc>
+          <w:tcPr>
+            <w:tcW w:type="dxa" w:w="4680"/>
+          </w:tcPr>
+          <w:p>
+            <w:r>
+              <w:rPr>
+                <w:sz w:val="22"/>
+              </w:rPr>
+              <w:t>https://github.com/hieune321/mas-project-topic1</w:t>
             </w:r>
           </w:p>
         </w:tc>

</xml_diff>

<commit_message>
fix: update team leader to Vo Ngoc Minh Quan across all documents, slides, scripts and app
</commit_message>
<xml_diff>
--- a/outputs/reports/Computer_Project_Topic_1_Report.docx
+++ b/outputs/reports/Computer_Project_Topic_1_Report.docx
@@ -213,11 +213,11 @@
               <w:rPr>
                 <w:sz w:val="22"/>
               </w:rPr>
-              <w:t>Mai Xuân Hiếu — DE200199 (Nhóm trưởng)</w:t>
+              <w:t>Mai Xuân Hiếu — DE200199 (Thành viên)</w:t>
               <w:br/>
               <w:t>Phan Dương Sinh — DE200235 (Thành viên)</w:t>
               <w:br/>
-              <w:t>Võ Ngọc Minh Quân — DE200080 (Thành viên)</w:t>
+              <w:t>Võ Ngọc Minh Quân — DE200080 (Nhóm trưởng)</w:t>
               <w:br/>
               <w:t>Vũ Hữu Thái — DE200132 (Thành viên)</w:t>
               <w:br/>
@@ -2979,7 +2979,7 @@
               <w:rPr>
                 <w:sz w:val="19"/>
               </w:rPr>
-              <w:t>Nhóm trưởng</w:t>
+              <w:t>Thành viên</w:t>
             </w:r>
           </w:p>
         </w:tc>
@@ -2993,7 +2993,7 @@
               <w:rPr>
                 <w:sz w:val="19"/>
               </w:rPr>
-              <w:t>Quản lý tiến độ dự án, tổ chức phân công, xây dựng kiến trúc mã nguồn Python &amp; Streamlit, tổng hợp và định dạng báo cáo Word/PDF (Câu 1, 2).</w:t>
+              <w:t>Thu thập dữ liệu khảo sát ẩn danh, kiểm tra tính hợp lệ, thiết kế quy chuẩn đạo đức nghiên cứu và làm sạch dữ liệu (Câu 1, 2).</w:t>
             </w:r>
           </w:p>
         </w:tc>
@@ -3058,7 +3058,7 @@
               <w:rPr>
                 <w:sz w:val="19"/>
               </w:rPr>
-              <w:t>Thu thập dữ liệu khảo sát ẩn danh, kiểm tra tính hợp lệ, viết module làm sạch dữ liệu và thống kê mô tả (Câu 1, 2, 3, 4).</w:t>
+              <w:t>Xử lý thống kê mô tả, tính toán độ tập trung, độ phân tán và vẽ biểu đồ phân phối Histogram &amp; Boxplot (Câu 3, 4).</w:t>
             </w:r>
           </w:p>
         </w:tc>
@@ -3105,7 +3105,7 @@
               <w:rPr>
                 <w:sz w:val="19"/>
               </w:rPr>
-              <w:t>Thành viên</w:t>
+              <w:t>Nhóm trưởng</w:t>
             </w:r>
           </w:p>
         </w:tc>
@@ -3119,7 +3119,7 @@
               <w:rPr>
                 <w:sz w:val="19"/>
               </w:rPr>
-              <w:t>Vẽ đồ thị phân phối Histogram, Boxplot, phân tích ngoại lệ 1.5 IQR, tính tương quan Pearson và vẽ Scatterplot, hồi quy OLS (Câu 4, 5, 6, 7).</w:t>
+              <w:t>Nhóm trưởng: Quản lý tiến độ dự án, tổ chức phân công, xây dựng kiến trúc mã nguồn Python &amp; Streamlit, ước lượng tương quan Pearson và OLS (Câu 5, 6, 7).</w:t>
             </w:r>
           </w:p>
         </w:tc>

</xml_diff>